<commit_message>
Implement Google Drive integration, signatures, PDFs and bugfixes
</commit_message>
<xml_diff>
--- a/plantillas/INFORME_GESTION_TEMPLATE.docx
+++ b/plantillas/INFORME_GESTION_TEMPLATE.docx
@@ -570,10 +570,8 @@
       </w:pPr>
       <w:bookmarkStart w:id="0" w:name="_heading=h.v6oneejqqmfo" w:colFirst="0" w:colLast="0"/>
       <w:bookmarkStart w:id="1" w:name="_heading=h.gjdgxs" w:colFirst="0" w:colLast="0"/>
-      <w:bookmarkStart w:id="2" w:name="_GoBack"/>
       <w:bookmarkEnd w:id="0"/>
       <w:bookmarkEnd w:id="1"/>
-      <w:bookmarkEnd w:id="2"/>
       <w:r>
         <w:rPr>
           <w:rFonts w:ascii="Arial" w:eastAsia="Arial" w:hAnsi="Arial" w:cs="Arial"/>
@@ -809,6 +807,28 @@
     </w:p>
     <w:p>
       <w:pPr>
+        <w:ind w:left="-142" w:firstLine="142"/>
+        <w:rPr>
+          <w:rFonts w:ascii="Arial" w:hAnsi="Arial" w:cs="Arial"/>
+        </w:rPr>
+      </w:pPr>
+    </w:p>
+    <w:p>
+      <w:pPr>
+        <w:ind w:left="-142" w:firstLine="142"/>
+        <w:rPr>
+          <w:rFonts w:ascii="Arial" w:hAnsi="Arial" w:cs="Arial"/>
+        </w:rPr>
+      </w:pPr>
+      <w:r>
+        <w:rPr>
+          <w:rFonts w:ascii="Arial" w:hAnsi="Arial" w:cs="Arial"/>
+        </w:rPr>
+        <w:t>${FIRMA_CONTRATISTA}</w:t>
+      </w:r>
+    </w:p>
+    <w:p>
+      <w:pPr>
         <w:rPr>
           <w:rFonts w:ascii="Arial" w:hAnsi="Arial" w:cs="Arial"/>
         </w:rPr>
@@ -862,6 +882,8 @@
         </w:rPr>
         <w:t xml:space="preserve"> </w:t>
       </w:r>
+      <w:bookmarkStart w:id="2" w:name="_GoBack"/>
+      <w:bookmarkEnd w:id="2"/>
     </w:p>
     <w:sectPr>
       <w:footerReference w:type="default" r:id="rId9"/>
@@ -6521,7 +6543,7 @@
 </file>
 
 <file path=customXml/itemProps1.xml><?xml version="1.0" encoding="utf-8"?>
-<ds:datastoreItem xmlns:ds="http://schemas.openxmlformats.org/officeDocument/2006/customXml" ds:itemID="{65FD51DD-EFC5-4EEA-8AD8-2902AE2C0A72}">
+<ds:datastoreItem xmlns:ds="http://schemas.openxmlformats.org/officeDocument/2006/customXml" ds:itemID="{F2197775-2F25-4CBC-80E9-B7F7A1AD13CC}">
   <ds:schemaRefs>
     <ds:schemaRef ds:uri="http://schemas.openxmlformats.org/officeDocument/2006/bibliography"/>
   </ds:schemaRefs>

</xml_diff>

<commit_message>
Fix: Ajustes en los márgenes y alineación (centrada) de las tablas en las plantillas de Word para evitar que se desborden de los márgenes de la página
</commit_message>
<xml_diff>
--- a/plantillas/INFORME_GESTION_TEMPLATE.docx
+++ b/plantillas/INFORME_GESTION_TEMPLATE.docx
@@ -1,6 +1,6 @@
 
 <file path=word/document.xml><?xml version="1.0" encoding="utf-8"?>
-<w:document xmlns:wpc="http://schemas.microsoft.com/office/word/2010/wordprocessingCanvas" xmlns:mc="http://schemas.openxmlformats.org/markup-compatibility/2006" xmlns:o="urn:schemas-microsoft-com:office:office" xmlns:r="http://schemas.openxmlformats.org/officeDocument/2006/relationships" xmlns:m="http://schemas.openxmlformats.org/officeDocument/2006/math" xmlns:v="urn:schemas-microsoft-com:vml" xmlns:wp14="http://schemas.microsoft.com/office/word/2010/wordprocessingDrawing" xmlns:wp="http://schemas.openxmlformats.org/drawingml/2006/wordprocessingDrawing" xmlns:w10="urn:schemas-microsoft-com:office:word" xmlns:w="http://schemas.openxmlformats.org/wordprocessingml/2006/main" xmlns:w14="http://schemas.microsoft.com/office/word/2010/wordml" xmlns:wpg="http://schemas.microsoft.com/office/word/2010/wordprocessingGroup" xmlns:wpi="http://schemas.microsoft.com/office/word/2010/wordprocessingInk" xmlns:wne="http://schemas.microsoft.com/office/word/2006/wordml" xmlns:wps="http://schemas.microsoft.com/office/word/2010/wordprocessingShape" mc:Ignorable="w14 wp14">
+<w:document xmlns:wpc="http://schemas.microsoft.com/office/word/2010/wordprocessingCanvas" xmlns:cx="http://schemas.microsoft.com/office/drawing/2014/chartex" xmlns:cx1="http://schemas.microsoft.com/office/drawing/2015/9/8/chartex" xmlns:cx2="http://schemas.microsoft.com/office/drawing/2015/10/21/chartex" xmlns:cx3="http://schemas.microsoft.com/office/drawing/2016/5/9/chartex" xmlns:cx4="http://schemas.microsoft.com/office/drawing/2016/5/10/chartex" xmlns:cx5="http://schemas.microsoft.com/office/drawing/2016/5/11/chartex" xmlns:cx6="http://schemas.microsoft.com/office/drawing/2016/5/12/chartex" xmlns:cx7="http://schemas.microsoft.com/office/drawing/2016/5/13/chartex" xmlns:cx8="http://schemas.microsoft.com/office/drawing/2016/5/14/chartex" xmlns:mc="http://schemas.openxmlformats.org/markup-compatibility/2006" xmlns:aink="http://schemas.microsoft.com/office/drawing/2016/ink" xmlns:am3d="http://schemas.microsoft.com/office/drawing/2017/model3d" xmlns:o="urn:schemas-microsoft-com:office:office" xmlns:oel="http://schemas.microsoft.com/office/2019/extlst" xmlns:r="http://schemas.openxmlformats.org/officeDocument/2006/relationships" xmlns:m="http://schemas.openxmlformats.org/officeDocument/2006/math" xmlns:v="urn:schemas-microsoft-com:vml" xmlns:wp14="http://schemas.microsoft.com/office/word/2010/wordprocessingDrawing" xmlns:wp="http://schemas.openxmlformats.org/drawingml/2006/wordprocessingDrawing" xmlns:w10="urn:schemas-microsoft-com:office:word" xmlns:w="http://schemas.openxmlformats.org/wordprocessingml/2006/main" xmlns:w14="http://schemas.microsoft.com/office/word/2010/wordml" xmlns:w15="http://schemas.microsoft.com/office/word/2012/wordml" xmlns:w16cex="http://schemas.microsoft.com/office/word/2018/wordml/cex" xmlns:w16cid="http://schemas.microsoft.com/office/word/2016/wordml/cid" xmlns:w16="http://schemas.microsoft.com/office/word/2018/wordml" xmlns:w16du="http://schemas.microsoft.com/office/word/2023/wordml/word16du" xmlns:w16sdtdh="http://schemas.microsoft.com/office/word/2020/wordml/sdtdatahash" xmlns:w16sdtfl="http://schemas.microsoft.com/office/word/2024/wordml/sdtformatlock" xmlns:w16se="http://schemas.microsoft.com/office/word/2015/wordml/symex" xmlns:wpg="http://schemas.microsoft.com/office/word/2010/wordprocessingGroup" xmlns:wpi="http://schemas.microsoft.com/office/word/2010/wordprocessingInk" xmlns:wne="http://schemas.microsoft.com/office/word/2006/wordml" xmlns:wps="http://schemas.microsoft.com/office/word/2010/wordprocessingShape" mc:Ignorable="w14 w15 w16se w16cid w16 w16cex w16sdtdh w16sdtfl w16du wp14">
   <w:body>
     <w:p>
       <w:pPr>
@@ -11,8 +11,8 @@
     </w:p>
     <w:tbl>
       <w:tblPr>
-        <w:tblpPr w:leftFromText="141" w:rightFromText="141" w:vertAnchor="text" w:tblpY="132"/>
         <w:tblW w:w="5000" w:type="pct"/>
+        <w:jc w:val="center"/>
         <w:tblBorders>
           <w:top w:val="single" w:sz="4" w:space="0" w:color="000000"/>
           <w:left w:val="single" w:sz="4" w:space="0" w:color="000000"/>
@@ -30,6 +30,7 @@
       <w:tr>
         <w:trPr>
           <w:trHeight w:val="269"/>
+          <w:jc w:val="center"/>
         </w:trPr>
         <w:tc>
           <w:tcPr>
@@ -96,6 +97,7 @@
       <w:tr>
         <w:trPr>
           <w:trHeight w:val="269"/>
+          <w:jc w:val="center"/>
         </w:trPr>
         <w:tc>
           <w:tcPr>
@@ -162,6 +164,7 @@
       <w:tr>
         <w:trPr>
           <w:trHeight w:val="269"/>
+          <w:jc w:val="center"/>
         </w:trPr>
         <w:tc>
           <w:tcPr>
@@ -227,6 +230,7 @@
       <w:tr>
         <w:trPr>
           <w:trHeight w:val="269"/>
+          <w:jc w:val="center"/>
         </w:trPr>
         <w:tc>
           <w:tcPr>
@@ -293,6 +297,7 @@
       <w:tr>
         <w:trPr>
           <w:trHeight w:val="269"/>
+          <w:jc w:val="center"/>
         </w:trPr>
         <w:tc>
           <w:tcPr>
@@ -359,6 +364,7 @@
       <w:tr>
         <w:trPr>
           <w:trHeight w:val="269"/>
+          <w:jc w:val="center"/>
         </w:trPr>
         <w:tc>
           <w:tcPr>
@@ -424,6 +430,7 @@
       <w:tr>
         <w:trPr>
           <w:trHeight w:val="269"/>
+          <w:jc w:val="center"/>
         </w:trPr>
         <w:tc>
           <w:tcPr>
@@ -523,13 +530,16 @@
       <w:tblPr>
         <w:tblStyle w:val="Tablaconcuadrcula"/>
         <w:tblW w:w="5000" w:type="pct"/>
-        <w:tblInd w:w="2" w:type="dxa"/>
+        <w:jc w:val="center"/>
         <w:tblLook w:val="04A0" w:firstRow="1" w:lastRow="0" w:firstColumn="1" w:lastColumn="0" w:noHBand="0" w:noVBand="1"/>
       </w:tblPr>
       <w:tblGrid>
         <w:gridCol w:w="9620"/>
       </w:tblGrid>
       <w:tr>
+        <w:trPr>
+          <w:jc w:val="center"/>
+        </w:trPr>
         <w:tc>
           <w:tcPr>
             <w:tcW w:w="5000" w:type="pct"/>
@@ -882,11 +892,9 @@
         </w:rPr>
         <w:t xml:space="preserve"> </w:t>
       </w:r>
-      <w:bookmarkStart w:id="2" w:name="_GoBack"/>
-      <w:bookmarkEnd w:id="2"/>
     </w:p>
     <w:sectPr>
-      <w:footerReference w:type="default" r:id="rId9"/>
+      <w:footerReference w:type="default" r:id="rId8"/>
       <w:pgSz w:w="12240" w:h="15840" w:code="1"/>
       <w:pgMar w:top="1418" w:right="1418" w:bottom="1418" w:left="1418" w:header="851" w:footer="851" w:gutter="0"/>
       <w:cols w:space="708"/>
@@ -897,7 +905,7 @@
 </file>
 
 <file path=word/endnotes.xml><?xml version="1.0" encoding="utf-8"?>
-<w:endnotes xmlns:wpc="http://schemas.microsoft.com/office/word/2010/wordprocessingCanvas" xmlns:mc="http://schemas.openxmlformats.org/markup-compatibility/2006" xmlns:o="urn:schemas-microsoft-com:office:office" xmlns:r="http://schemas.openxmlformats.org/officeDocument/2006/relationships" xmlns:m="http://schemas.openxmlformats.org/officeDocument/2006/math" xmlns:v="urn:schemas-microsoft-com:vml" xmlns:wp14="http://schemas.microsoft.com/office/word/2010/wordprocessingDrawing" xmlns:wp="http://schemas.openxmlformats.org/drawingml/2006/wordprocessingDrawing" xmlns:w10="urn:schemas-microsoft-com:office:word" xmlns:w="http://schemas.openxmlformats.org/wordprocessingml/2006/main" xmlns:w14="http://schemas.microsoft.com/office/word/2010/wordml" xmlns:wpg="http://schemas.microsoft.com/office/word/2010/wordprocessingGroup" xmlns:wpi="http://schemas.microsoft.com/office/word/2010/wordprocessingInk" xmlns:wne="http://schemas.microsoft.com/office/word/2006/wordml" xmlns:wps="http://schemas.microsoft.com/office/word/2010/wordprocessingShape" mc:Ignorable="w14 wp14">
+<w:endnotes xmlns:wpc="http://schemas.microsoft.com/office/word/2010/wordprocessingCanvas" xmlns:cx="http://schemas.microsoft.com/office/drawing/2014/chartex" xmlns:cx1="http://schemas.microsoft.com/office/drawing/2015/9/8/chartex" xmlns:cx2="http://schemas.microsoft.com/office/drawing/2015/10/21/chartex" xmlns:cx3="http://schemas.microsoft.com/office/drawing/2016/5/9/chartex" xmlns:cx4="http://schemas.microsoft.com/office/drawing/2016/5/10/chartex" xmlns:cx5="http://schemas.microsoft.com/office/drawing/2016/5/11/chartex" xmlns:cx6="http://schemas.microsoft.com/office/drawing/2016/5/12/chartex" xmlns:cx7="http://schemas.microsoft.com/office/drawing/2016/5/13/chartex" xmlns:cx8="http://schemas.microsoft.com/office/drawing/2016/5/14/chartex" xmlns:mc="http://schemas.openxmlformats.org/markup-compatibility/2006" xmlns:aink="http://schemas.microsoft.com/office/drawing/2016/ink" xmlns:am3d="http://schemas.microsoft.com/office/drawing/2017/model3d" xmlns:o="urn:schemas-microsoft-com:office:office" xmlns:oel="http://schemas.microsoft.com/office/2019/extlst" xmlns:r="http://schemas.openxmlformats.org/officeDocument/2006/relationships" xmlns:m="http://schemas.openxmlformats.org/officeDocument/2006/math" xmlns:v="urn:schemas-microsoft-com:vml" xmlns:wp14="http://schemas.microsoft.com/office/word/2010/wordprocessingDrawing" xmlns:wp="http://schemas.openxmlformats.org/drawingml/2006/wordprocessingDrawing" xmlns:w10="urn:schemas-microsoft-com:office:word" xmlns:w="http://schemas.openxmlformats.org/wordprocessingml/2006/main" xmlns:w14="http://schemas.microsoft.com/office/word/2010/wordml" xmlns:w15="http://schemas.microsoft.com/office/word/2012/wordml" xmlns:w16cex="http://schemas.microsoft.com/office/word/2018/wordml/cex" xmlns:w16cid="http://schemas.microsoft.com/office/word/2016/wordml/cid" xmlns:w16="http://schemas.microsoft.com/office/word/2018/wordml" xmlns:w16du="http://schemas.microsoft.com/office/word/2023/wordml/word16du" xmlns:w16sdtdh="http://schemas.microsoft.com/office/word/2020/wordml/sdtdatahash" xmlns:w16sdtfl="http://schemas.microsoft.com/office/word/2024/wordml/sdtformatlock" xmlns:w16se="http://schemas.microsoft.com/office/word/2015/wordml/symex" xmlns:wpg="http://schemas.microsoft.com/office/word/2010/wordprocessingGroup" xmlns:wpi="http://schemas.microsoft.com/office/word/2010/wordprocessingInk" xmlns:wne="http://schemas.microsoft.com/office/word/2006/wordml" xmlns:wps="http://schemas.microsoft.com/office/word/2010/wordprocessingShape" mc:Ignorable="w14 w15 w16se w16cid w16 w16cex w16sdtdh w16sdtfl w16du wp14">
   <w:endnote w:type="separator" w:id="-1">
     <w:p>
       <w:r>
@@ -916,7 +924,7 @@
 </file>
 
 <file path=word/footer1.xml><?xml version="1.0" encoding="utf-8"?>
-<w:ftr xmlns:wpc="http://schemas.microsoft.com/office/word/2010/wordprocessingCanvas" xmlns:mc="http://schemas.openxmlformats.org/markup-compatibility/2006" xmlns:o="urn:schemas-microsoft-com:office:office" xmlns:r="http://schemas.openxmlformats.org/officeDocument/2006/relationships" xmlns:m="http://schemas.openxmlformats.org/officeDocument/2006/math" xmlns:v="urn:schemas-microsoft-com:vml" xmlns:wp14="http://schemas.microsoft.com/office/word/2010/wordprocessingDrawing" xmlns:wp="http://schemas.openxmlformats.org/drawingml/2006/wordprocessingDrawing" xmlns:w10="urn:schemas-microsoft-com:office:word" xmlns:w="http://schemas.openxmlformats.org/wordprocessingml/2006/main" xmlns:w14="http://schemas.microsoft.com/office/word/2010/wordml" xmlns:wpg="http://schemas.microsoft.com/office/word/2010/wordprocessingGroup" xmlns:wpi="http://schemas.microsoft.com/office/word/2010/wordprocessingInk" xmlns:wne="http://schemas.microsoft.com/office/word/2006/wordml" xmlns:wps="http://schemas.microsoft.com/office/word/2010/wordprocessingShape" mc:Ignorable="w14 wp14">
+<w:ftr xmlns:wpc="http://schemas.microsoft.com/office/word/2010/wordprocessingCanvas" xmlns:cx="http://schemas.microsoft.com/office/drawing/2014/chartex" xmlns:cx1="http://schemas.microsoft.com/office/drawing/2015/9/8/chartex" xmlns:cx2="http://schemas.microsoft.com/office/drawing/2015/10/21/chartex" xmlns:cx3="http://schemas.microsoft.com/office/drawing/2016/5/9/chartex" xmlns:cx4="http://schemas.microsoft.com/office/drawing/2016/5/10/chartex" xmlns:cx5="http://schemas.microsoft.com/office/drawing/2016/5/11/chartex" xmlns:cx6="http://schemas.microsoft.com/office/drawing/2016/5/12/chartex" xmlns:cx7="http://schemas.microsoft.com/office/drawing/2016/5/13/chartex" xmlns:cx8="http://schemas.microsoft.com/office/drawing/2016/5/14/chartex" xmlns:mc="http://schemas.openxmlformats.org/markup-compatibility/2006" xmlns:aink="http://schemas.microsoft.com/office/drawing/2016/ink" xmlns:am3d="http://schemas.microsoft.com/office/drawing/2017/model3d" xmlns:o="urn:schemas-microsoft-com:office:office" xmlns:oel="http://schemas.microsoft.com/office/2019/extlst" xmlns:r="http://schemas.openxmlformats.org/officeDocument/2006/relationships" xmlns:m="http://schemas.openxmlformats.org/officeDocument/2006/math" xmlns:v="urn:schemas-microsoft-com:vml" xmlns:wp14="http://schemas.microsoft.com/office/word/2010/wordprocessingDrawing" xmlns:wp="http://schemas.openxmlformats.org/drawingml/2006/wordprocessingDrawing" xmlns:w10="urn:schemas-microsoft-com:office:word" xmlns:w="http://schemas.openxmlformats.org/wordprocessingml/2006/main" xmlns:w14="http://schemas.microsoft.com/office/word/2010/wordml" xmlns:w15="http://schemas.microsoft.com/office/word/2012/wordml" xmlns:w16cex="http://schemas.microsoft.com/office/word/2018/wordml/cex" xmlns:w16cid="http://schemas.microsoft.com/office/word/2016/wordml/cid" xmlns:w16="http://schemas.microsoft.com/office/word/2018/wordml" xmlns:w16du="http://schemas.microsoft.com/office/word/2023/wordml/word16du" xmlns:w16sdtdh="http://schemas.microsoft.com/office/word/2020/wordml/sdtdatahash" xmlns:w16sdtfl="http://schemas.microsoft.com/office/word/2024/wordml/sdtformatlock" xmlns:w16se="http://schemas.microsoft.com/office/word/2015/wordml/symex" xmlns:wpg="http://schemas.microsoft.com/office/word/2010/wordprocessingGroup" xmlns:wpi="http://schemas.microsoft.com/office/word/2010/wordprocessingInk" xmlns:wne="http://schemas.microsoft.com/office/word/2006/wordml" xmlns:wps="http://schemas.microsoft.com/office/word/2010/wordprocessingShape" mc:Ignorable="w14 w15 w16se w16cid w16 w16cex w16sdtdh w16sdtfl w16du wp14">
   <w:sdt>
     <w:sdtPr>
       <w:id w:val="-1320423896"/>
@@ -925,7 +933,6 @@
         <w:docPartUnique/>
       </w:docPartObj>
     </w:sdtPr>
-    <w:sdtEndPr/>
     <w:sdtContent>
       <w:p>
         <w:pPr>
@@ -963,7 +970,7 @@
 </file>
 
 <file path=word/footnotes.xml><?xml version="1.0" encoding="utf-8"?>
-<w:footnotes xmlns:wpc="http://schemas.microsoft.com/office/word/2010/wordprocessingCanvas" xmlns:mc="http://schemas.openxmlformats.org/markup-compatibility/2006" xmlns:o="urn:schemas-microsoft-com:office:office" xmlns:r="http://schemas.openxmlformats.org/officeDocument/2006/relationships" xmlns:m="http://schemas.openxmlformats.org/officeDocument/2006/math" xmlns:v="urn:schemas-microsoft-com:vml" xmlns:wp14="http://schemas.microsoft.com/office/word/2010/wordprocessingDrawing" xmlns:wp="http://schemas.openxmlformats.org/drawingml/2006/wordprocessingDrawing" xmlns:w10="urn:schemas-microsoft-com:office:word" xmlns:w="http://schemas.openxmlformats.org/wordprocessingml/2006/main" xmlns:w14="http://schemas.microsoft.com/office/word/2010/wordml" xmlns:wpg="http://schemas.microsoft.com/office/word/2010/wordprocessingGroup" xmlns:wpi="http://schemas.microsoft.com/office/word/2010/wordprocessingInk" xmlns:wne="http://schemas.microsoft.com/office/word/2006/wordml" xmlns:wps="http://schemas.microsoft.com/office/word/2010/wordprocessingShape" mc:Ignorable="w14 wp14">
+<w:footnotes xmlns:wpc="http://schemas.microsoft.com/office/word/2010/wordprocessingCanvas" xmlns:cx="http://schemas.microsoft.com/office/drawing/2014/chartex" xmlns:cx1="http://schemas.microsoft.com/office/drawing/2015/9/8/chartex" xmlns:cx2="http://schemas.microsoft.com/office/drawing/2015/10/21/chartex" xmlns:cx3="http://schemas.microsoft.com/office/drawing/2016/5/9/chartex" xmlns:cx4="http://schemas.microsoft.com/office/drawing/2016/5/10/chartex" xmlns:cx5="http://schemas.microsoft.com/office/drawing/2016/5/11/chartex" xmlns:cx6="http://schemas.microsoft.com/office/drawing/2016/5/12/chartex" xmlns:cx7="http://schemas.microsoft.com/office/drawing/2016/5/13/chartex" xmlns:cx8="http://schemas.microsoft.com/office/drawing/2016/5/14/chartex" xmlns:mc="http://schemas.openxmlformats.org/markup-compatibility/2006" xmlns:aink="http://schemas.microsoft.com/office/drawing/2016/ink" xmlns:am3d="http://schemas.microsoft.com/office/drawing/2017/model3d" xmlns:o="urn:schemas-microsoft-com:office:office" xmlns:oel="http://schemas.microsoft.com/office/2019/extlst" xmlns:r="http://schemas.openxmlformats.org/officeDocument/2006/relationships" xmlns:m="http://schemas.openxmlformats.org/officeDocument/2006/math" xmlns:v="urn:schemas-microsoft-com:vml" xmlns:wp14="http://schemas.microsoft.com/office/word/2010/wordprocessingDrawing" xmlns:wp="http://schemas.openxmlformats.org/drawingml/2006/wordprocessingDrawing" xmlns:w10="urn:schemas-microsoft-com:office:word" xmlns:w="http://schemas.openxmlformats.org/wordprocessingml/2006/main" xmlns:w14="http://schemas.microsoft.com/office/word/2010/wordml" xmlns:w15="http://schemas.microsoft.com/office/word/2012/wordml" xmlns:w16cex="http://schemas.microsoft.com/office/word/2018/wordml/cex" xmlns:w16cid="http://schemas.microsoft.com/office/word/2016/wordml/cid" xmlns:w16="http://schemas.microsoft.com/office/word/2018/wordml" xmlns:w16du="http://schemas.microsoft.com/office/word/2023/wordml/word16du" xmlns:w16sdtdh="http://schemas.microsoft.com/office/word/2020/wordml/sdtdatahash" xmlns:w16sdtfl="http://schemas.microsoft.com/office/word/2024/wordml/sdtformatlock" xmlns:w16se="http://schemas.microsoft.com/office/word/2015/wordml/symex" xmlns:wpg="http://schemas.microsoft.com/office/word/2010/wordprocessingGroup" xmlns:wpi="http://schemas.microsoft.com/office/word/2010/wordprocessingInk" xmlns:wne="http://schemas.microsoft.com/office/word/2006/wordml" xmlns:wps="http://schemas.microsoft.com/office/word/2010/wordprocessingShape" mc:Ignorable="w14 w15 w16se w16cid w16 w16cex w16sdtdh w16sdtfl w16du wp14">
   <w:footnote w:type="separator" w:id="-1">
     <w:p>
       <w:r>
@@ -982,8 +989,8 @@
 </file>
 
 <file path=word/numbering.xml><?xml version="1.0" encoding="utf-8"?>
-<w:numbering xmlns:wpc="http://schemas.microsoft.com/office/word/2010/wordprocessingCanvas" xmlns:mc="http://schemas.openxmlformats.org/markup-compatibility/2006" xmlns:o="urn:schemas-microsoft-com:office:office" xmlns:r="http://schemas.openxmlformats.org/officeDocument/2006/relationships" xmlns:m="http://schemas.openxmlformats.org/officeDocument/2006/math" xmlns:v="urn:schemas-microsoft-com:vml" xmlns:wp14="http://schemas.microsoft.com/office/word/2010/wordprocessingDrawing" xmlns:wp="http://schemas.openxmlformats.org/drawingml/2006/wordprocessingDrawing" xmlns:w10="urn:schemas-microsoft-com:office:word" xmlns:w="http://schemas.openxmlformats.org/wordprocessingml/2006/main" xmlns:w14="http://schemas.microsoft.com/office/word/2010/wordml" xmlns:wpg="http://schemas.microsoft.com/office/word/2010/wordprocessingGroup" xmlns:wpi="http://schemas.microsoft.com/office/word/2010/wordprocessingInk" xmlns:wne="http://schemas.microsoft.com/office/word/2006/wordml" xmlns:wps="http://schemas.microsoft.com/office/word/2010/wordprocessingShape" mc:Ignorable="w14 wp14">
-  <w:abstractNum w:abstractNumId="0">
+<w:numbering xmlns:wpc="http://schemas.microsoft.com/office/word/2010/wordprocessingCanvas" xmlns:cx="http://schemas.microsoft.com/office/drawing/2014/chartex" xmlns:cx1="http://schemas.microsoft.com/office/drawing/2015/9/8/chartex" xmlns:cx2="http://schemas.microsoft.com/office/drawing/2015/10/21/chartex" xmlns:cx3="http://schemas.microsoft.com/office/drawing/2016/5/9/chartex" xmlns:cx4="http://schemas.microsoft.com/office/drawing/2016/5/10/chartex" xmlns:cx5="http://schemas.microsoft.com/office/drawing/2016/5/11/chartex" xmlns:cx6="http://schemas.microsoft.com/office/drawing/2016/5/12/chartex" xmlns:cx7="http://schemas.microsoft.com/office/drawing/2016/5/13/chartex" xmlns:cx8="http://schemas.microsoft.com/office/drawing/2016/5/14/chartex" xmlns:mc="http://schemas.openxmlformats.org/markup-compatibility/2006" xmlns:aink="http://schemas.microsoft.com/office/drawing/2016/ink" xmlns:am3d="http://schemas.microsoft.com/office/drawing/2017/model3d" xmlns:o="urn:schemas-microsoft-com:office:office" xmlns:oel="http://schemas.microsoft.com/office/2019/extlst" xmlns:r="http://schemas.openxmlformats.org/officeDocument/2006/relationships" xmlns:m="http://schemas.openxmlformats.org/officeDocument/2006/math" xmlns:v="urn:schemas-microsoft-com:vml" xmlns:wp14="http://schemas.microsoft.com/office/word/2010/wordprocessingDrawing" xmlns:wp="http://schemas.openxmlformats.org/drawingml/2006/wordprocessingDrawing" xmlns:w10="urn:schemas-microsoft-com:office:word" xmlns:w="http://schemas.openxmlformats.org/wordprocessingml/2006/main" xmlns:w14="http://schemas.microsoft.com/office/word/2010/wordml" xmlns:w15="http://schemas.microsoft.com/office/word/2012/wordml" xmlns:w16cex="http://schemas.microsoft.com/office/word/2018/wordml/cex" xmlns:w16cid="http://schemas.microsoft.com/office/word/2016/wordml/cid" xmlns:w16="http://schemas.microsoft.com/office/word/2018/wordml" xmlns:w16du="http://schemas.microsoft.com/office/word/2023/wordml/word16du" xmlns:w16sdtdh="http://schemas.microsoft.com/office/word/2020/wordml/sdtdatahash" xmlns:w16sdtfl="http://schemas.microsoft.com/office/word/2024/wordml/sdtformatlock" xmlns:w16se="http://schemas.microsoft.com/office/word/2015/wordml/symex" xmlns:wpg="http://schemas.microsoft.com/office/word/2010/wordprocessingGroup" xmlns:wpi="http://schemas.microsoft.com/office/word/2010/wordprocessingInk" xmlns:wne="http://schemas.microsoft.com/office/word/2006/wordml" xmlns:wps="http://schemas.microsoft.com/office/word/2010/wordprocessingShape" mc:Ignorable="w14 w15 w16se w16cid w16 w16cex w16sdtdh w16sdtfl w16du wp14">
+  <w:abstractNum w:abstractNumId="0" w15:restartNumberingAfterBreak="0">
     <w:nsid w:val="004745FA"/>
     <w:multiLevelType w:val="hybridMultilevel"/>
     <w:tmpl w:val="33A46A00"/>
@@ -1096,7 +1103,7 @@
       </w:rPr>
     </w:lvl>
   </w:abstractNum>
-  <w:abstractNum w:abstractNumId="1">
+  <w:abstractNum w:abstractNumId="1" w15:restartNumberingAfterBreak="0">
     <w:nsid w:val="02E70306"/>
     <w:multiLevelType w:val="multilevel"/>
     <w:tmpl w:val="502622D0"/>
@@ -1209,7 +1216,7 @@
       </w:rPr>
     </w:lvl>
   </w:abstractNum>
-  <w:abstractNum w:abstractNumId="2">
+  <w:abstractNum w:abstractNumId="2" w15:restartNumberingAfterBreak="0">
     <w:nsid w:val="0830474C"/>
     <w:multiLevelType w:val="hybridMultilevel"/>
     <w:tmpl w:val="56E86AA4"/>
@@ -1322,7 +1329,7 @@
       </w:rPr>
     </w:lvl>
   </w:abstractNum>
-  <w:abstractNum w:abstractNumId="3">
+  <w:abstractNum w:abstractNumId="3" w15:restartNumberingAfterBreak="0">
     <w:nsid w:val="0ECF4107"/>
     <w:multiLevelType w:val="multilevel"/>
     <w:tmpl w:val="E8B27CB6"/>
@@ -1411,7 +1418,7 @@
       </w:pPr>
     </w:lvl>
   </w:abstractNum>
-  <w:abstractNum w:abstractNumId="4">
+  <w:abstractNum w:abstractNumId="4" w15:restartNumberingAfterBreak="0">
     <w:nsid w:val="11675085"/>
     <w:multiLevelType w:val="multilevel"/>
     <w:tmpl w:val="746E0BEA"/>
@@ -1524,7 +1531,7 @@
       </w:rPr>
     </w:lvl>
   </w:abstractNum>
-  <w:abstractNum w:abstractNumId="5">
+  <w:abstractNum w:abstractNumId="5" w15:restartNumberingAfterBreak="0">
     <w:nsid w:val="143C793F"/>
     <w:multiLevelType w:val="multilevel"/>
     <w:tmpl w:val="5130285E"/>
@@ -1637,7 +1644,7 @@
       </w:rPr>
     </w:lvl>
   </w:abstractNum>
-  <w:abstractNum w:abstractNumId="6">
+  <w:abstractNum w:abstractNumId="6" w15:restartNumberingAfterBreak="0">
     <w:nsid w:val="14DB50ED"/>
     <w:multiLevelType w:val="hybridMultilevel"/>
     <w:tmpl w:val="73306FF8"/>
@@ -1750,7 +1757,7 @@
       </w:rPr>
     </w:lvl>
   </w:abstractNum>
-  <w:abstractNum w:abstractNumId="7">
+  <w:abstractNum w:abstractNumId="7" w15:restartNumberingAfterBreak="0">
     <w:nsid w:val="1AEC15B7"/>
     <w:multiLevelType w:val="hybridMultilevel"/>
     <w:tmpl w:val="6B225D16"/>
@@ -1863,7 +1870,7 @@
       </w:rPr>
     </w:lvl>
   </w:abstractNum>
-  <w:abstractNum w:abstractNumId="8">
+  <w:abstractNum w:abstractNumId="8" w15:restartNumberingAfterBreak="0">
     <w:nsid w:val="25061751"/>
     <w:multiLevelType w:val="multilevel"/>
     <w:tmpl w:val="438A92B2"/>
@@ -1976,7 +1983,7 @@
       </w:rPr>
     </w:lvl>
   </w:abstractNum>
-  <w:abstractNum w:abstractNumId="9">
+  <w:abstractNum w:abstractNumId="9" w15:restartNumberingAfterBreak="0">
     <w:nsid w:val="27122072"/>
     <w:multiLevelType w:val="hybridMultilevel"/>
     <w:tmpl w:val="31D2A650"/>
@@ -2089,7 +2096,7 @@
       </w:rPr>
     </w:lvl>
   </w:abstractNum>
-  <w:abstractNum w:abstractNumId="10">
+  <w:abstractNum w:abstractNumId="10" w15:restartNumberingAfterBreak="0">
     <w:nsid w:val="2E1F17FE"/>
     <w:multiLevelType w:val="hybridMultilevel"/>
     <w:tmpl w:val="54862ABC"/>
@@ -2202,7 +2209,7 @@
       </w:rPr>
     </w:lvl>
   </w:abstractNum>
-  <w:abstractNum w:abstractNumId="11">
+  <w:abstractNum w:abstractNumId="11" w15:restartNumberingAfterBreak="0">
     <w:nsid w:val="32023516"/>
     <w:multiLevelType w:val="hybridMultilevel"/>
     <w:tmpl w:val="0AC81EEA"/>
@@ -2315,7 +2322,7 @@
       </w:rPr>
     </w:lvl>
   </w:abstractNum>
-  <w:abstractNum w:abstractNumId="12">
+  <w:abstractNum w:abstractNumId="12" w15:restartNumberingAfterBreak="0">
     <w:nsid w:val="3C124C66"/>
     <w:multiLevelType w:val="multilevel"/>
     <w:tmpl w:val="4FBAE980"/>
@@ -2428,7 +2435,7 @@
       </w:rPr>
     </w:lvl>
   </w:abstractNum>
-  <w:abstractNum w:abstractNumId="13">
+  <w:abstractNum w:abstractNumId="13" w15:restartNumberingAfterBreak="0">
     <w:nsid w:val="3C30399D"/>
     <w:multiLevelType w:val="multilevel"/>
     <w:tmpl w:val="E692EA78"/>
@@ -2541,7 +2548,7 @@
       </w:rPr>
     </w:lvl>
   </w:abstractNum>
-  <w:abstractNum w:abstractNumId="14">
+  <w:abstractNum w:abstractNumId="14" w15:restartNumberingAfterBreak="0">
     <w:nsid w:val="41326106"/>
     <w:multiLevelType w:val="hybridMultilevel"/>
     <w:tmpl w:val="57C6A1B6"/>
@@ -2654,7 +2661,7 @@
       </w:rPr>
     </w:lvl>
   </w:abstractNum>
-  <w:abstractNum w:abstractNumId="15">
+  <w:abstractNum w:abstractNumId="15" w15:restartNumberingAfterBreak="0">
     <w:nsid w:val="41521DC6"/>
     <w:multiLevelType w:val="hybridMultilevel"/>
     <w:tmpl w:val="FD8813DE"/>
@@ -2767,7 +2774,7 @@
       </w:rPr>
     </w:lvl>
   </w:abstractNum>
-  <w:abstractNum w:abstractNumId="16">
+  <w:abstractNum w:abstractNumId="16" w15:restartNumberingAfterBreak="0">
     <w:nsid w:val="45290B2A"/>
     <w:multiLevelType w:val="multilevel"/>
     <w:tmpl w:val="1576CE76"/>
@@ -2880,7 +2887,7 @@
       </w:rPr>
     </w:lvl>
   </w:abstractNum>
-  <w:abstractNum w:abstractNumId="17">
+  <w:abstractNum w:abstractNumId="17" w15:restartNumberingAfterBreak="0">
     <w:nsid w:val="4B7E698A"/>
     <w:multiLevelType w:val="hybridMultilevel"/>
     <w:tmpl w:val="58F2C754"/>
@@ -2993,7 +3000,7 @@
       </w:rPr>
     </w:lvl>
   </w:abstractNum>
-  <w:abstractNum w:abstractNumId="18">
+  <w:abstractNum w:abstractNumId="18" w15:restartNumberingAfterBreak="0">
     <w:nsid w:val="51B37CA6"/>
     <w:multiLevelType w:val="multilevel"/>
     <w:tmpl w:val="A0369E82"/>
@@ -3106,7 +3113,7 @@
       </w:rPr>
     </w:lvl>
   </w:abstractNum>
-  <w:abstractNum w:abstractNumId="19">
+  <w:abstractNum w:abstractNumId="19" w15:restartNumberingAfterBreak="0">
     <w:nsid w:val="51D0676E"/>
     <w:multiLevelType w:val="hybridMultilevel"/>
     <w:tmpl w:val="9042C14E"/>
@@ -3219,7 +3226,7 @@
       </w:rPr>
     </w:lvl>
   </w:abstractNum>
-  <w:abstractNum w:abstractNumId="20">
+  <w:abstractNum w:abstractNumId="20" w15:restartNumberingAfterBreak="0">
     <w:nsid w:val="5D1412B1"/>
     <w:multiLevelType w:val="hybridMultilevel"/>
     <w:tmpl w:val="5E56A766"/>
@@ -3332,7 +3339,7 @@
       </w:rPr>
     </w:lvl>
   </w:abstractNum>
-  <w:abstractNum w:abstractNumId="21">
+  <w:abstractNum w:abstractNumId="21" w15:restartNumberingAfterBreak="0">
     <w:nsid w:val="5D1F2D26"/>
     <w:multiLevelType w:val="hybridMultilevel"/>
     <w:tmpl w:val="8AD240D0"/>
@@ -3445,7 +3452,7 @@
       </w:rPr>
     </w:lvl>
   </w:abstractNum>
-  <w:abstractNum w:abstractNumId="22">
+  <w:abstractNum w:abstractNumId="22" w15:restartNumberingAfterBreak="0">
     <w:nsid w:val="5DC51F49"/>
     <w:multiLevelType w:val="hybridMultilevel"/>
     <w:tmpl w:val="CD629E36"/>
@@ -3558,7 +3565,7 @@
       </w:rPr>
     </w:lvl>
   </w:abstractNum>
-  <w:abstractNum w:abstractNumId="23">
+  <w:abstractNum w:abstractNumId="23" w15:restartNumberingAfterBreak="0">
     <w:nsid w:val="63FD212D"/>
     <w:multiLevelType w:val="multilevel"/>
     <w:tmpl w:val="DB92F31A"/>
@@ -3671,7 +3678,7 @@
       </w:rPr>
     </w:lvl>
   </w:abstractNum>
-  <w:abstractNum w:abstractNumId="24">
+  <w:abstractNum w:abstractNumId="24" w15:restartNumberingAfterBreak="0">
     <w:nsid w:val="645B41ED"/>
     <w:multiLevelType w:val="hybridMultilevel"/>
     <w:tmpl w:val="94864A40"/>
@@ -3784,7 +3791,7 @@
       </w:rPr>
     </w:lvl>
   </w:abstractNum>
-  <w:abstractNum w:abstractNumId="25">
+  <w:abstractNum w:abstractNumId="25" w15:restartNumberingAfterBreak="0">
     <w:nsid w:val="650D7858"/>
     <w:multiLevelType w:val="multilevel"/>
     <w:tmpl w:val="29F6339E"/>
@@ -3897,7 +3904,7 @@
       </w:rPr>
     </w:lvl>
   </w:abstractNum>
-  <w:abstractNum w:abstractNumId="26">
+  <w:abstractNum w:abstractNumId="26" w15:restartNumberingAfterBreak="0">
     <w:nsid w:val="667A349B"/>
     <w:multiLevelType w:val="multilevel"/>
     <w:tmpl w:val="A934AD64"/>
@@ -4010,7 +4017,7 @@
       </w:rPr>
     </w:lvl>
   </w:abstractNum>
-  <w:abstractNum w:abstractNumId="27">
+  <w:abstractNum w:abstractNumId="27" w15:restartNumberingAfterBreak="0">
     <w:nsid w:val="6B697269"/>
     <w:multiLevelType w:val="multilevel"/>
     <w:tmpl w:val="C8CA91B8"/>
@@ -4123,7 +4130,7 @@
       </w:rPr>
     </w:lvl>
   </w:abstractNum>
-  <w:abstractNum w:abstractNumId="28">
+  <w:abstractNum w:abstractNumId="28" w15:restartNumberingAfterBreak="0">
     <w:nsid w:val="71C72369"/>
     <w:multiLevelType w:val="multilevel"/>
     <w:tmpl w:val="4D02BF62"/>
@@ -4236,7 +4243,7 @@
       </w:rPr>
     </w:lvl>
   </w:abstractNum>
-  <w:abstractNum w:abstractNumId="29">
+  <w:abstractNum w:abstractNumId="29" w15:restartNumberingAfterBreak="0">
     <w:nsid w:val="73670859"/>
     <w:multiLevelType w:val="multilevel"/>
     <w:tmpl w:val="02ACE158"/>
@@ -4349,7 +4356,7 @@
       </w:rPr>
     </w:lvl>
   </w:abstractNum>
-  <w:abstractNum w:abstractNumId="30">
+  <w:abstractNum w:abstractNumId="30" w15:restartNumberingAfterBreak="0">
     <w:nsid w:val="76F720F9"/>
     <w:multiLevelType w:val="multilevel"/>
     <w:tmpl w:val="2B64F2AE"/>
@@ -4462,7 +4469,7 @@
       </w:rPr>
     </w:lvl>
   </w:abstractNum>
-  <w:abstractNum w:abstractNumId="31">
+  <w:abstractNum w:abstractNumId="31" w15:restartNumberingAfterBreak="0">
     <w:nsid w:val="7A2B2879"/>
     <w:multiLevelType w:val="multilevel"/>
     <w:tmpl w:val="B7A6D326"/>
@@ -4577,7 +4584,7 @@
       </w:rPr>
     </w:lvl>
   </w:abstractNum>
-  <w:abstractNum w:abstractNumId="32">
+  <w:abstractNum w:abstractNumId="32" w15:restartNumberingAfterBreak="0">
     <w:nsid w:val="7E47384D"/>
     <w:multiLevelType w:val="multilevel"/>
     <w:tmpl w:val="3D10DD66"/>
@@ -4690,109 +4697,109 @@
       </w:rPr>
     </w:lvl>
   </w:abstractNum>
-  <w:num w:numId="1">
+  <w:num w:numId="1" w16cid:durableId="825247240">
     <w:abstractNumId w:val="10"/>
   </w:num>
-  <w:num w:numId="2">
+  <w:num w:numId="2" w16cid:durableId="805009764">
     <w:abstractNumId w:val="14"/>
   </w:num>
-  <w:num w:numId="3">
+  <w:num w:numId="3" w16cid:durableId="1705594398">
     <w:abstractNumId w:val="11"/>
   </w:num>
-  <w:num w:numId="4">
+  <w:num w:numId="4" w16cid:durableId="689840417">
     <w:abstractNumId w:val="20"/>
   </w:num>
-  <w:num w:numId="5">
+  <w:num w:numId="5" w16cid:durableId="426467481">
     <w:abstractNumId w:val="22"/>
   </w:num>
-  <w:num w:numId="6">
+  <w:num w:numId="6" w16cid:durableId="1415710329">
     <w:abstractNumId w:val="6"/>
   </w:num>
-  <w:num w:numId="7">
+  <w:num w:numId="7" w16cid:durableId="769161056">
     <w:abstractNumId w:val="15"/>
   </w:num>
-  <w:num w:numId="8">
+  <w:num w:numId="8" w16cid:durableId="700327146">
     <w:abstractNumId w:val="17"/>
   </w:num>
-  <w:num w:numId="9">
+  <w:num w:numId="9" w16cid:durableId="2121101302">
     <w:abstractNumId w:val="0"/>
   </w:num>
-  <w:num w:numId="10">
+  <w:num w:numId="10" w16cid:durableId="917834457">
     <w:abstractNumId w:val="2"/>
   </w:num>
-  <w:num w:numId="11">
+  <w:num w:numId="11" w16cid:durableId="17390440">
     <w:abstractNumId w:val="7"/>
   </w:num>
-  <w:num w:numId="12">
+  <w:num w:numId="12" w16cid:durableId="538857620">
     <w:abstractNumId w:val="10"/>
   </w:num>
-  <w:num w:numId="13">
+  <w:num w:numId="13" w16cid:durableId="2070419184">
     <w:abstractNumId w:val="0"/>
   </w:num>
-  <w:num w:numId="14">
+  <w:num w:numId="14" w16cid:durableId="358232">
     <w:abstractNumId w:val="21"/>
   </w:num>
-  <w:num w:numId="15">
+  <w:num w:numId="15" w16cid:durableId="1117869031">
     <w:abstractNumId w:val="24"/>
   </w:num>
-  <w:num w:numId="16">
+  <w:num w:numId="16" w16cid:durableId="244922203">
     <w:abstractNumId w:val="9"/>
   </w:num>
-  <w:num w:numId="17">
+  <w:num w:numId="17" w16cid:durableId="1147667364">
     <w:abstractNumId w:val="19"/>
   </w:num>
-  <w:num w:numId="18">
+  <w:num w:numId="18" w16cid:durableId="677125000">
     <w:abstractNumId w:val="28"/>
   </w:num>
-  <w:num w:numId="19">
+  <w:num w:numId="19" w16cid:durableId="288362936">
     <w:abstractNumId w:val="4"/>
   </w:num>
-  <w:num w:numId="20">
+  <w:num w:numId="20" w16cid:durableId="1159539696">
     <w:abstractNumId w:val="3"/>
   </w:num>
-  <w:num w:numId="21">
+  <w:num w:numId="21" w16cid:durableId="1028217941">
     <w:abstractNumId w:val="30"/>
   </w:num>
-  <w:num w:numId="22">
+  <w:num w:numId="22" w16cid:durableId="7372777">
     <w:abstractNumId w:val="18"/>
   </w:num>
-  <w:num w:numId="23">
+  <w:num w:numId="23" w16cid:durableId="1541477512">
     <w:abstractNumId w:val="25"/>
   </w:num>
-  <w:num w:numId="24">
+  <w:num w:numId="24" w16cid:durableId="8879196">
     <w:abstractNumId w:val="16"/>
   </w:num>
-  <w:num w:numId="25">
+  <w:num w:numId="25" w16cid:durableId="1907063628">
     <w:abstractNumId w:val="29"/>
   </w:num>
-  <w:num w:numId="26">
+  <w:num w:numId="26" w16cid:durableId="425467713">
     <w:abstractNumId w:val="32"/>
   </w:num>
-  <w:num w:numId="27">
+  <w:num w:numId="27" w16cid:durableId="1702441654">
     <w:abstractNumId w:val="1"/>
   </w:num>
-  <w:num w:numId="28">
+  <w:num w:numId="28" w16cid:durableId="1842963714">
     <w:abstractNumId w:val="26"/>
   </w:num>
-  <w:num w:numId="29">
+  <w:num w:numId="29" w16cid:durableId="1996882495">
     <w:abstractNumId w:val="12"/>
   </w:num>
-  <w:num w:numId="30">
+  <w:num w:numId="30" w16cid:durableId="1574316453">
     <w:abstractNumId w:val="13"/>
   </w:num>
-  <w:num w:numId="31">
+  <w:num w:numId="31" w16cid:durableId="1137994505">
     <w:abstractNumId w:val="5"/>
   </w:num>
-  <w:num w:numId="32">
+  <w:num w:numId="32" w16cid:durableId="905652769">
     <w:abstractNumId w:val="27"/>
   </w:num>
-  <w:num w:numId="33">
+  <w:num w:numId="33" w16cid:durableId="501241214">
     <w:abstractNumId w:val="23"/>
   </w:num>
-  <w:num w:numId="34">
+  <w:num w:numId="34" w16cid:durableId="1135218105">
     <w:abstractNumId w:val="31"/>
   </w:num>
-  <w:num w:numId="35">
+  <w:num w:numId="35" w16cid:durableId="168063793">
     <w:abstractNumId w:val="8"/>
   </w:num>
   <w:numIdMacAtCleanup w:val="3"/>
@@ -4800,7 +4807,7 @@
 </file>
 
 <file path=word/styles.xml><?xml version="1.0" encoding="utf-8"?>
-<w:styles xmlns:mc="http://schemas.openxmlformats.org/markup-compatibility/2006" xmlns:r="http://schemas.openxmlformats.org/officeDocument/2006/relationships" xmlns:w="http://schemas.openxmlformats.org/wordprocessingml/2006/main" xmlns:w14="http://schemas.microsoft.com/office/word/2010/wordml" mc:Ignorable="w14">
+<w:styles xmlns:mc="http://schemas.openxmlformats.org/markup-compatibility/2006" xmlns:r="http://schemas.openxmlformats.org/officeDocument/2006/relationships" xmlns:w="http://schemas.openxmlformats.org/wordprocessingml/2006/main" xmlns:w14="http://schemas.microsoft.com/office/word/2010/wordml" xmlns:w15="http://schemas.microsoft.com/office/word/2012/wordml" xmlns:w16cex="http://schemas.microsoft.com/office/word/2018/wordml/cex" xmlns:w16cid="http://schemas.microsoft.com/office/word/2016/wordml/cid" xmlns:w16="http://schemas.microsoft.com/office/word/2018/wordml" xmlns:w16du="http://schemas.microsoft.com/office/word/2023/wordml/word16du" xmlns:w16sdtdh="http://schemas.microsoft.com/office/word/2020/wordml/sdtdatahash" xmlns:w16sdtfl="http://schemas.microsoft.com/office/word/2024/wordml/sdtformatlock" xmlns:w16se="http://schemas.microsoft.com/office/word/2015/wordml/symex" mc:Ignorable="w14 w15 w16se w16cid w16 w16cex w16sdtdh w16sdtfl w16du">
   <w:docDefaults>
     <w:rPrDefault>
       <w:rPr>
@@ -4810,7 +4817,7 @@
     </w:rPrDefault>
     <w:pPrDefault/>
   </w:docDefaults>
-  <w:latentStyles w:defLockedState="0" w:defUIPriority="0" w:defSemiHidden="0" w:defUnhideWhenUsed="0" w:defQFormat="0" w:count="267">
+  <w:latentStyles w:defLockedState="0" w:defUIPriority="0" w:defSemiHidden="0" w:defUnhideWhenUsed="0" w:defQFormat="0" w:count="376">
     <w:lsdException w:name="Normal" w:qFormat="1"/>
     <w:lsdException w:name="heading 1" w:qFormat="1"/>
     <w:lsdException w:name="heading 2" w:semiHidden="1" w:unhideWhenUsed="1" w:qFormat="1"/>
@@ -4832,9 +4839,53 @@
     <w:lsdException w:name="Strong" w:qFormat="1"/>
     <w:lsdException w:name="Emphasis" w:qFormat="1"/>
     <w:lsdException w:name="Normal (Web)" w:uiPriority="99"/>
+    <w:lsdException w:name="Normal Table" w:semiHidden="1" w:unhideWhenUsed="1"/>
     <w:lsdException w:name="annotation subject" w:uiPriority="99"/>
     <w:lsdException w:name="No List" w:uiPriority="99"/>
+    <w:lsdException w:name="Table Simple 1" w:semiHidden="1" w:unhideWhenUsed="1"/>
+    <w:lsdException w:name="Table Simple 2" w:semiHidden="1" w:unhideWhenUsed="1"/>
+    <w:lsdException w:name="Table Simple 3" w:semiHidden="1" w:unhideWhenUsed="1"/>
+    <w:lsdException w:name="Table Classic 1" w:semiHidden="1" w:unhideWhenUsed="1"/>
+    <w:lsdException w:name="Table Classic 2" w:semiHidden="1" w:unhideWhenUsed="1"/>
+    <w:lsdException w:name="Table Classic 3" w:semiHidden="1" w:unhideWhenUsed="1"/>
+    <w:lsdException w:name="Table Classic 4" w:semiHidden="1" w:unhideWhenUsed="1"/>
+    <w:lsdException w:name="Table Colorful 1" w:semiHidden="1" w:unhideWhenUsed="1"/>
+    <w:lsdException w:name="Table Colorful 2" w:semiHidden="1" w:unhideWhenUsed="1"/>
+    <w:lsdException w:name="Table Colorful 3" w:semiHidden="1" w:unhideWhenUsed="1"/>
+    <w:lsdException w:name="Table Columns 1" w:semiHidden="1" w:unhideWhenUsed="1"/>
+    <w:lsdException w:name="Table Columns 2" w:semiHidden="1" w:unhideWhenUsed="1"/>
+    <w:lsdException w:name="Table Columns 3" w:semiHidden="1" w:unhideWhenUsed="1"/>
+    <w:lsdException w:name="Table Columns 4" w:semiHidden="1" w:unhideWhenUsed="1"/>
+    <w:lsdException w:name="Table Columns 5" w:semiHidden="1" w:unhideWhenUsed="1"/>
+    <w:lsdException w:name="Table Grid 1" w:semiHidden="1" w:unhideWhenUsed="1"/>
+    <w:lsdException w:name="Table Grid 2" w:semiHidden="1" w:unhideWhenUsed="1"/>
+    <w:lsdException w:name="Table Grid 3" w:semiHidden="1" w:unhideWhenUsed="1"/>
+    <w:lsdException w:name="Table Grid 4" w:semiHidden="1" w:unhideWhenUsed="1"/>
+    <w:lsdException w:name="Table Grid 5" w:semiHidden="1" w:unhideWhenUsed="1"/>
+    <w:lsdException w:name="Table Grid 6" w:semiHidden="1" w:unhideWhenUsed="1"/>
+    <w:lsdException w:name="Table Grid 7" w:semiHidden="1" w:unhideWhenUsed="1"/>
+    <w:lsdException w:name="Table Grid 8" w:semiHidden="1" w:unhideWhenUsed="1"/>
+    <w:lsdException w:name="Table List 1" w:semiHidden="1" w:unhideWhenUsed="1"/>
+    <w:lsdException w:name="Table List 2" w:semiHidden="1" w:unhideWhenUsed="1"/>
+    <w:lsdException w:name="Table List 3" w:semiHidden="1" w:unhideWhenUsed="1"/>
+    <w:lsdException w:name="Table List 4" w:semiHidden="1" w:unhideWhenUsed="1"/>
+    <w:lsdException w:name="Table List 5" w:semiHidden="1" w:unhideWhenUsed="1"/>
+    <w:lsdException w:name="Table List 6" w:semiHidden="1" w:unhideWhenUsed="1"/>
+    <w:lsdException w:name="Table List 7" w:semiHidden="1" w:unhideWhenUsed="1"/>
+    <w:lsdException w:name="Table List 8" w:semiHidden="1" w:unhideWhenUsed="1"/>
+    <w:lsdException w:name="Table 3D effects 1" w:semiHidden="1" w:unhideWhenUsed="1"/>
+    <w:lsdException w:name="Table 3D effects 2" w:semiHidden="1" w:unhideWhenUsed="1"/>
+    <w:lsdException w:name="Table 3D effects 3" w:semiHidden="1" w:unhideWhenUsed="1"/>
+    <w:lsdException w:name="Table Contemporary" w:semiHidden="1" w:unhideWhenUsed="1"/>
+    <w:lsdException w:name="Table Elegant" w:semiHidden="1" w:unhideWhenUsed="1"/>
+    <w:lsdException w:name="Table Professional" w:semiHidden="1" w:unhideWhenUsed="1"/>
+    <w:lsdException w:name="Table Subtle 1" w:semiHidden="1" w:unhideWhenUsed="1"/>
+    <w:lsdException w:name="Table Subtle 2" w:semiHidden="1" w:unhideWhenUsed="1"/>
+    <w:lsdException w:name="Table Web 1" w:semiHidden="1" w:unhideWhenUsed="1"/>
+    <w:lsdException w:name="Table Web 2" w:semiHidden="1" w:unhideWhenUsed="1"/>
+    <w:lsdException w:name="Table Web 3" w:semiHidden="1" w:unhideWhenUsed="1"/>
     <w:lsdException w:name="Table Grid" w:uiPriority="39"/>
+    <w:lsdException w:name="Table Theme" w:semiHidden="1" w:unhideWhenUsed="1"/>
     <w:lsdException w:name="Placeholder Text" w:semiHidden="1" w:uiPriority="99"/>
     <w:lsdException w:name="No Spacing" w:qFormat="1"/>
     <w:lsdException w:name="Light Shading" w:uiPriority="60"/>
@@ -4946,6 +4997,115 @@
     <w:lsdException w:name="Book Title" w:uiPriority="33" w:qFormat="1"/>
     <w:lsdException w:name="Bibliography" w:semiHidden="1" w:uiPriority="37" w:unhideWhenUsed="1"/>
     <w:lsdException w:name="TOC Heading" w:semiHidden="1" w:uiPriority="39" w:unhideWhenUsed="1" w:qFormat="1"/>
+    <w:lsdException w:name="Plain Table 1" w:uiPriority="41"/>
+    <w:lsdException w:name="Plain Table 2" w:uiPriority="42"/>
+    <w:lsdException w:name="Plain Table 3" w:uiPriority="43"/>
+    <w:lsdException w:name="Plain Table 4" w:uiPriority="44"/>
+    <w:lsdException w:name="Plain Table 5" w:uiPriority="45"/>
+    <w:lsdException w:name="Grid Table Light" w:uiPriority="40"/>
+    <w:lsdException w:name="Grid Table 1 Light" w:uiPriority="46"/>
+    <w:lsdException w:name="Grid Table 2" w:uiPriority="47"/>
+    <w:lsdException w:name="Grid Table 3" w:uiPriority="48"/>
+    <w:lsdException w:name="Grid Table 4" w:uiPriority="49"/>
+    <w:lsdException w:name="Grid Table 5 Dark" w:uiPriority="50"/>
+    <w:lsdException w:name="Grid Table 6 Colorful" w:uiPriority="51"/>
+    <w:lsdException w:name="Grid Table 7 Colorful" w:uiPriority="52"/>
+    <w:lsdException w:name="Grid Table 1 Light Accent 1" w:uiPriority="46"/>
+    <w:lsdException w:name="Grid Table 2 Accent 1" w:uiPriority="47"/>
+    <w:lsdException w:name="Grid Table 3 Accent 1" w:uiPriority="48"/>
+    <w:lsdException w:name="Grid Table 4 Accent 1" w:uiPriority="49"/>
+    <w:lsdException w:name="Grid Table 5 Dark Accent 1" w:uiPriority="50"/>
+    <w:lsdException w:name="Grid Table 6 Colorful Accent 1" w:uiPriority="51"/>
+    <w:lsdException w:name="Grid Table 7 Colorful Accent 1" w:uiPriority="52"/>
+    <w:lsdException w:name="Grid Table 1 Light Accent 2" w:uiPriority="46"/>
+    <w:lsdException w:name="Grid Table 2 Accent 2" w:uiPriority="47"/>
+    <w:lsdException w:name="Grid Table 3 Accent 2" w:uiPriority="48"/>
+    <w:lsdException w:name="Grid Table 4 Accent 2" w:uiPriority="49"/>
+    <w:lsdException w:name="Grid Table 5 Dark Accent 2" w:uiPriority="50"/>
+    <w:lsdException w:name="Grid Table 6 Colorful Accent 2" w:uiPriority="51"/>
+    <w:lsdException w:name="Grid Table 7 Colorful Accent 2" w:uiPriority="52"/>
+    <w:lsdException w:name="Grid Table 1 Light Accent 3" w:uiPriority="46"/>
+    <w:lsdException w:name="Grid Table 2 Accent 3" w:uiPriority="47"/>
+    <w:lsdException w:name="Grid Table 3 Accent 3" w:uiPriority="48"/>
+    <w:lsdException w:name="Grid Table 4 Accent 3" w:uiPriority="49"/>
+    <w:lsdException w:name="Grid Table 5 Dark Accent 3" w:uiPriority="50"/>
+    <w:lsdException w:name="Grid Table 6 Colorful Accent 3" w:uiPriority="51"/>
+    <w:lsdException w:name="Grid Table 7 Colorful Accent 3" w:uiPriority="52"/>
+    <w:lsdException w:name="Grid Table 1 Light Accent 4" w:uiPriority="46"/>
+    <w:lsdException w:name="Grid Table 2 Accent 4" w:uiPriority="47"/>
+    <w:lsdException w:name="Grid Table 3 Accent 4" w:uiPriority="48"/>
+    <w:lsdException w:name="Grid Table 4 Accent 4" w:uiPriority="49"/>
+    <w:lsdException w:name="Grid Table 5 Dark Accent 4" w:uiPriority="50"/>
+    <w:lsdException w:name="Grid Table 6 Colorful Accent 4" w:uiPriority="51"/>
+    <w:lsdException w:name="Grid Table 7 Colorful Accent 4" w:uiPriority="52"/>
+    <w:lsdException w:name="Grid Table 1 Light Accent 5" w:uiPriority="46"/>
+    <w:lsdException w:name="Grid Table 2 Accent 5" w:uiPriority="47"/>
+    <w:lsdException w:name="Grid Table 3 Accent 5" w:uiPriority="48"/>
+    <w:lsdException w:name="Grid Table 4 Accent 5" w:uiPriority="49"/>
+    <w:lsdException w:name="Grid Table 5 Dark Accent 5" w:uiPriority="50"/>
+    <w:lsdException w:name="Grid Table 6 Colorful Accent 5" w:uiPriority="51"/>
+    <w:lsdException w:name="Grid Table 7 Colorful Accent 5" w:uiPriority="52"/>
+    <w:lsdException w:name="Grid Table 1 Light Accent 6" w:uiPriority="46"/>
+    <w:lsdException w:name="Grid Table 2 Accent 6" w:uiPriority="47"/>
+    <w:lsdException w:name="Grid Table 3 Accent 6" w:uiPriority="48"/>
+    <w:lsdException w:name="Grid Table 4 Accent 6" w:uiPriority="49"/>
+    <w:lsdException w:name="Grid Table 5 Dark Accent 6" w:uiPriority="50"/>
+    <w:lsdException w:name="Grid Table 6 Colorful Accent 6" w:uiPriority="51"/>
+    <w:lsdException w:name="Grid Table 7 Colorful Accent 6" w:uiPriority="52"/>
+    <w:lsdException w:name="List Table 1 Light" w:uiPriority="46"/>
+    <w:lsdException w:name="List Table 2" w:uiPriority="47"/>
+    <w:lsdException w:name="List Table 3" w:uiPriority="48"/>
+    <w:lsdException w:name="List Table 4" w:uiPriority="49"/>
+    <w:lsdException w:name="List Table 5 Dark" w:uiPriority="50"/>
+    <w:lsdException w:name="List Table 6 Colorful" w:uiPriority="51"/>
+    <w:lsdException w:name="List Table 7 Colorful" w:uiPriority="52"/>
+    <w:lsdException w:name="List Table 1 Light Accent 1" w:uiPriority="46"/>
+    <w:lsdException w:name="List Table 2 Accent 1" w:uiPriority="47"/>
+    <w:lsdException w:name="List Table 3 Accent 1" w:uiPriority="48"/>
+    <w:lsdException w:name="List Table 4 Accent 1" w:uiPriority="49"/>
+    <w:lsdException w:name="List Table 5 Dark Accent 1" w:uiPriority="50"/>
+    <w:lsdException w:name="List Table 6 Colorful Accent 1" w:uiPriority="51"/>
+    <w:lsdException w:name="List Table 7 Colorful Accent 1" w:uiPriority="52"/>
+    <w:lsdException w:name="List Table 1 Light Accent 2" w:uiPriority="46"/>
+    <w:lsdException w:name="List Table 2 Accent 2" w:uiPriority="47"/>
+    <w:lsdException w:name="List Table 3 Accent 2" w:uiPriority="48"/>
+    <w:lsdException w:name="List Table 4 Accent 2" w:uiPriority="49"/>
+    <w:lsdException w:name="List Table 5 Dark Accent 2" w:uiPriority="50"/>
+    <w:lsdException w:name="List Table 6 Colorful Accent 2" w:uiPriority="51"/>
+    <w:lsdException w:name="List Table 7 Colorful Accent 2" w:uiPriority="52"/>
+    <w:lsdException w:name="List Table 1 Light Accent 3" w:uiPriority="46"/>
+    <w:lsdException w:name="List Table 2 Accent 3" w:uiPriority="47"/>
+    <w:lsdException w:name="List Table 3 Accent 3" w:uiPriority="48"/>
+    <w:lsdException w:name="List Table 4 Accent 3" w:uiPriority="49"/>
+    <w:lsdException w:name="List Table 5 Dark Accent 3" w:uiPriority="50"/>
+    <w:lsdException w:name="List Table 6 Colorful Accent 3" w:uiPriority="51"/>
+    <w:lsdException w:name="List Table 7 Colorful Accent 3" w:uiPriority="52"/>
+    <w:lsdException w:name="List Table 1 Light Accent 4" w:uiPriority="46"/>
+    <w:lsdException w:name="List Table 2 Accent 4" w:uiPriority="47"/>
+    <w:lsdException w:name="List Table 3 Accent 4" w:uiPriority="48"/>
+    <w:lsdException w:name="List Table 4 Accent 4" w:uiPriority="49"/>
+    <w:lsdException w:name="List Table 5 Dark Accent 4" w:uiPriority="50"/>
+    <w:lsdException w:name="List Table 6 Colorful Accent 4" w:uiPriority="51"/>
+    <w:lsdException w:name="List Table 7 Colorful Accent 4" w:uiPriority="52"/>
+    <w:lsdException w:name="List Table 1 Light Accent 5" w:uiPriority="46"/>
+    <w:lsdException w:name="List Table 2 Accent 5" w:uiPriority="47"/>
+    <w:lsdException w:name="List Table 3 Accent 5" w:uiPriority="48"/>
+    <w:lsdException w:name="List Table 4 Accent 5" w:uiPriority="49"/>
+    <w:lsdException w:name="List Table 5 Dark Accent 5" w:uiPriority="50"/>
+    <w:lsdException w:name="List Table 6 Colorful Accent 5" w:uiPriority="51"/>
+    <w:lsdException w:name="List Table 7 Colorful Accent 5" w:uiPriority="52"/>
+    <w:lsdException w:name="List Table 1 Light Accent 6" w:uiPriority="46"/>
+    <w:lsdException w:name="List Table 2 Accent 6" w:uiPriority="47"/>
+    <w:lsdException w:name="List Table 3 Accent 6" w:uiPriority="48"/>
+    <w:lsdException w:name="List Table 4 Accent 6" w:uiPriority="49"/>
+    <w:lsdException w:name="List Table 5 Dark Accent 6" w:uiPriority="50"/>
+    <w:lsdException w:name="List Table 6 Colorful Accent 6" w:uiPriority="51"/>
+    <w:lsdException w:name="List Table 7 Colorful Accent 6" w:uiPriority="52"/>
+    <w:lsdException w:name="Mention" w:semiHidden="1" w:uiPriority="99" w:unhideWhenUsed="1"/>
+    <w:lsdException w:name="Smart Hyperlink" w:semiHidden="1" w:uiPriority="99" w:unhideWhenUsed="1"/>
+    <w:lsdException w:name="Hashtag" w:semiHidden="1" w:uiPriority="99" w:unhideWhenUsed="1"/>
+    <w:lsdException w:name="Unresolved Mention" w:semiHidden="1" w:uiPriority="99" w:unhideWhenUsed="1"/>
+    <w:lsdException w:name="Smart Link" w:semiHidden="1" w:uiPriority="99" w:unhideWhenUsed="1"/>
   </w:latentStyles>
   <w:style w:type="paragraph" w:default="1" w:styleId="Normal">
     <w:name w:val="Normal"/>
@@ -5238,7 +5398,6 @@
     <w:uiPriority w:val="39"/>
     <w:rsid w:val="00723C2D"/>
     <w:tblPr>
-      <w:tblInd w:w="0" w:type="dxa"/>
       <w:tblBorders>
         <w:top w:val="single" w:sz="4" w:space="0" w:color="auto"/>
         <w:left w:val="single" w:sz="4" w:space="0" w:color="auto"/>
@@ -5247,739 +5406,6 @@
         <w:insideH w:val="single" w:sz="4" w:space="0" w:color="auto"/>
         <w:insideV w:val="single" w:sz="4" w:space="0" w:color="auto"/>
       </w:tblBorders>
-      <w:tblCellMar>
-        <w:top w:w="0" w:type="dxa"/>
-        <w:left w:w="108" w:type="dxa"/>
-        <w:bottom w:w="0" w:type="dxa"/>
-        <w:right w:w="108" w:type="dxa"/>
-      </w:tblCellMar>
-    </w:tblPr>
-  </w:style>
-  <w:style w:type="character" w:styleId="Refdenotaalpie">
-    <w:name w:val="footnote reference"/>
-    <w:rsid w:val="00FB2290"/>
-    <w:rPr>
-      <w:position w:val="0"/>
-      <w:vertAlign w:val="superscript"/>
-    </w:rPr>
-  </w:style>
-  <w:style w:type="paragraph" w:styleId="Sinespaciado">
-    <w:name w:val="No Spacing"/>
-    <w:qFormat/>
-    <w:rsid w:val="00BA6BC5"/>
-    <w:pPr>
-      <w:suppressAutoHyphens/>
-      <w:autoSpaceDN w:val="0"/>
-      <w:textAlignment w:val="baseline"/>
-    </w:pPr>
-    <w:rPr>
-      <w:lang w:val="es-ES" w:eastAsia="es-ES"/>
-    </w:rPr>
-  </w:style>
-  <w:style w:type="paragraph" w:customStyle="1" w:styleId="Standard">
-    <w:name w:val="Standard"/>
-    <w:rsid w:val="00F172FB"/>
-    <w:pPr>
-      <w:widowControl w:val="0"/>
-      <w:suppressAutoHyphens/>
-      <w:autoSpaceDN w:val="0"/>
-      <w:textAlignment w:val="baseline"/>
-    </w:pPr>
-    <w:rPr>
-      <w:rFonts w:eastAsia="Arial Unicode MS"/>
-      <w:kern w:val="3"/>
-      <w:sz w:val="24"/>
-      <w:szCs w:val="24"/>
-      <w:lang w:eastAsia="zh-CN"/>
-    </w:rPr>
-  </w:style>
-  <w:style w:type="character" w:customStyle="1" w:styleId="il">
-    <w:name w:val="il"/>
-    <w:rsid w:val="00CB28A8"/>
-  </w:style>
-  <w:style w:type="character" w:customStyle="1" w:styleId="Ttulo1Car">
-    <w:name w:val="Título 1 Car"/>
-    <w:link w:val="Ttulo1"/>
-    <w:rsid w:val="0054589C"/>
-    <w:rPr>
-      <w:sz w:val="24"/>
-      <w:lang w:eastAsia="es-ES"/>
-    </w:rPr>
-  </w:style>
-  <w:style w:type="character" w:customStyle="1" w:styleId="Ttulo2Car">
-    <w:name w:val="Título 2 Car"/>
-    <w:link w:val="Ttulo2"/>
-    <w:rsid w:val="0054589C"/>
-    <w:rPr>
-      <w:sz w:val="24"/>
-      <w:lang w:eastAsia="es-ES"/>
-    </w:rPr>
-  </w:style>
-  <w:style w:type="character" w:customStyle="1" w:styleId="Ttulo3Car">
-    <w:name w:val="Título 3 Car"/>
-    <w:link w:val="Ttulo3"/>
-    <w:rsid w:val="0054589C"/>
-    <w:rPr>
-      <w:b/>
-      <w:sz w:val="32"/>
-      <w:lang w:eastAsia="es-ES"/>
-    </w:rPr>
-  </w:style>
-  <w:style w:type="character" w:customStyle="1" w:styleId="Ttulo4Car">
-    <w:name w:val="Título 4 Car"/>
-    <w:link w:val="Ttulo4"/>
-    <w:rsid w:val="0054589C"/>
-    <w:rPr>
-      <w:b/>
-      <w:sz w:val="24"/>
-      <w:lang w:eastAsia="es-ES"/>
-    </w:rPr>
-  </w:style>
-  <w:style w:type="character" w:customStyle="1" w:styleId="Ttulo5Car">
-    <w:name w:val="Título 5 Car"/>
-    <w:link w:val="Ttulo5"/>
-    <w:rsid w:val="0054589C"/>
-    <w:rPr>
-      <w:b/>
-      <w:sz w:val="24"/>
-      <w:lang w:eastAsia="es-ES"/>
-    </w:rPr>
-  </w:style>
-  <w:style w:type="paragraph" w:styleId="Textoindependiente">
-    <w:name w:val="Body Text"/>
-    <w:basedOn w:val="Normal"/>
-    <w:link w:val="TextoindependienteCar"/>
-    <w:rsid w:val="0054589C"/>
-    <w:pPr>
-      <w:suppressAutoHyphens/>
-      <w:autoSpaceDN w:val="0"/>
-      <w:spacing w:line="480" w:lineRule="auto"/>
-      <w:textAlignment w:val="baseline"/>
-    </w:pPr>
-    <w:rPr>
-      <w:szCs w:val="20"/>
-      <w:lang w:val="es-CO"/>
-    </w:rPr>
-  </w:style>
-  <w:style w:type="character" w:customStyle="1" w:styleId="TextoindependienteCar">
-    <w:name w:val="Texto independiente Car"/>
-    <w:link w:val="Textoindependiente"/>
-    <w:rsid w:val="0054589C"/>
-    <w:rPr>
-      <w:sz w:val="24"/>
-      <w:lang w:eastAsia="es-ES"/>
-    </w:rPr>
-  </w:style>
-  <w:style w:type="paragraph" w:styleId="Mapadeldocumento">
-    <w:name w:val="Document Map"/>
-    <w:basedOn w:val="Normal"/>
-    <w:link w:val="MapadeldocumentoCar"/>
-    <w:rsid w:val="0054589C"/>
-    <w:pPr>
-      <w:shd w:val="clear" w:color="auto" w:fill="000080"/>
-      <w:suppressAutoHyphens/>
-      <w:autoSpaceDN w:val="0"/>
-      <w:textAlignment w:val="baseline"/>
-    </w:pPr>
-    <w:rPr>
-      <w:rFonts w:ascii="Tahoma" w:hAnsi="Tahoma" w:cs="Tahoma"/>
-      <w:sz w:val="20"/>
-      <w:szCs w:val="20"/>
-    </w:rPr>
-  </w:style>
-  <w:style w:type="character" w:customStyle="1" w:styleId="MapadeldocumentoCar">
-    <w:name w:val="Mapa del documento Car"/>
-    <w:link w:val="Mapadeldocumento"/>
-    <w:rsid w:val="0054589C"/>
-    <w:rPr>
-      <w:rFonts w:ascii="Tahoma" w:hAnsi="Tahoma" w:cs="Tahoma"/>
-      <w:shd w:val="clear" w:color="auto" w:fill="000080"/>
-      <w:lang w:val="es-ES" w:eastAsia="es-ES"/>
-    </w:rPr>
-  </w:style>
-  <w:style w:type="character" w:styleId="Nmerodepgina">
-    <w:name w:val="page number"/>
-    <w:rsid w:val="0054589C"/>
-  </w:style>
-  <w:style w:type="paragraph" w:styleId="Textonotapie">
-    <w:name w:val="footnote text"/>
-    <w:basedOn w:val="Normal"/>
-    <w:link w:val="TextonotapieCar"/>
-    <w:rsid w:val="0054589C"/>
-    <w:pPr>
-      <w:suppressAutoHyphens/>
-      <w:autoSpaceDN w:val="0"/>
-      <w:textAlignment w:val="baseline"/>
-    </w:pPr>
-    <w:rPr>
-      <w:sz w:val="20"/>
-      <w:szCs w:val="20"/>
-    </w:rPr>
-  </w:style>
-  <w:style w:type="character" w:customStyle="1" w:styleId="TextonotapieCar">
-    <w:name w:val="Texto nota pie Car"/>
-    <w:link w:val="Textonotapie"/>
-    <w:rsid w:val="0054589C"/>
-    <w:rPr>
-      <w:lang w:val="es-ES" w:eastAsia="es-ES"/>
-    </w:rPr>
-  </w:style>
-  <w:style w:type="character" w:customStyle="1" w:styleId="EncabezadoCar">
-    <w:name w:val="Encabezado Car"/>
-    <w:uiPriority w:val="99"/>
-    <w:rsid w:val="0054589C"/>
-    <w:rPr>
-      <w:lang w:eastAsia="es-ES"/>
-    </w:rPr>
-  </w:style>
-  <w:style w:type="paragraph" w:styleId="Revisin">
-    <w:name w:val="Revision"/>
-    <w:hidden/>
-    <w:uiPriority w:val="99"/>
-    <w:semiHidden/>
-    <w:rsid w:val="0054589C"/>
-    <w:rPr>
-      <w:lang w:val="es-ES" w:eastAsia="es-ES"/>
-    </w:rPr>
-  </w:style>
-  <w:style w:type="character" w:styleId="Refdecomentario">
-    <w:name w:val="annotation reference"/>
-    <w:uiPriority w:val="99"/>
-    <w:unhideWhenUsed/>
-    <w:rsid w:val="0054589C"/>
-    <w:rPr>
-      <w:sz w:val="16"/>
-      <w:szCs w:val="16"/>
-    </w:rPr>
-  </w:style>
-  <w:style w:type="paragraph" w:styleId="Textocomentario">
-    <w:name w:val="annotation text"/>
-    <w:basedOn w:val="Normal"/>
-    <w:link w:val="TextocomentarioCar"/>
-    <w:uiPriority w:val="99"/>
-    <w:unhideWhenUsed/>
-    <w:rsid w:val="0054589C"/>
-    <w:pPr>
-      <w:suppressAutoHyphens/>
-      <w:autoSpaceDN w:val="0"/>
-      <w:textAlignment w:val="baseline"/>
-    </w:pPr>
-    <w:rPr>
-      <w:sz w:val="20"/>
-      <w:szCs w:val="20"/>
-    </w:rPr>
-  </w:style>
-  <w:style w:type="character" w:customStyle="1" w:styleId="TextocomentarioCar">
-    <w:name w:val="Texto comentario Car"/>
-    <w:link w:val="Textocomentario"/>
-    <w:uiPriority w:val="99"/>
-    <w:rsid w:val="0054589C"/>
-    <w:rPr>
-      <w:lang w:val="es-ES" w:eastAsia="es-ES"/>
-    </w:rPr>
-  </w:style>
-  <w:style w:type="paragraph" w:styleId="Asuntodelcomentario">
-    <w:name w:val="annotation subject"/>
-    <w:basedOn w:val="Textocomentario"/>
-    <w:next w:val="Textocomentario"/>
-    <w:link w:val="AsuntodelcomentarioCar"/>
-    <w:uiPriority w:val="99"/>
-    <w:unhideWhenUsed/>
-    <w:rsid w:val="0054589C"/>
-    <w:rPr>
-      <w:b/>
-      <w:bCs/>
-    </w:rPr>
-  </w:style>
-  <w:style w:type="character" w:customStyle="1" w:styleId="AsuntodelcomentarioCar">
-    <w:name w:val="Asunto del comentario Car"/>
-    <w:link w:val="Asuntodelcomentario"/>
-    <w:uiPriority w:val="99"/>
-    <w:rsid w:val="0054589C"/>
-    <w:rPr>
-      <w:b/>
-      <w:bCs/>
-      <w:lang w:val="es-ES" w:eastAsia="es-ES"/>
-    </w:rPr>
-  </w:style>
-  <w:style w:type="character" w:customStyle="1" w:styleId="cd">
-    <w:name w:val="cd"/>
-    <w:rsid w:val="0054589C"/>
-  </w:style>
-  <w:style w:type="character" w:customStyle="1" w:styleId="noleidos">
-    <w:name w:val="no_leidos"/>
-    <w:rsid w:val="00D05A71"/>
-  </w:style>
-  <w:style w:type="character" w:customStyle="1" w:styleId="PrrafodelistaCar">
-    <w:name w:val="Párrafo de lista Car"/>
-    <w:aliases w:val="VIÑETA Car,VIÑETAS Car,Párrafo de lista2 Car,Viñetas Car,List Paragraph1 Car,Betulia Título 1 Car,Lista vistosa - Énfasis 13 Car,Fluvial1 Car,titulo 3 Car,List Paragraph Car,Párrafo de lista1 Car,Lista vistosa - Énfasis 11 Car"/>
-    <w:link w:val="Prrafodelista"/>
-    <w:uiPriority w:val="34"/>
-    <w:locked/>
-    <w:rsid w:val="008D00F2"/>
-    <w:rPr>
-      <w:sz w:val="24"/>
-      <w:szCs w:val="24"/>
-      <w:lang w:val="es-ES" w:eastAsia="es-ES"/>
-    </w:rPr>
-  </w:style>
-</w:styles>
-</file>
-
-<file path=word/stylesWithEffects.xml><?xml version="1.0" encoding="utf-8"?>
-<w:styles xmlns:wpc="http://schemas.microsoft.com/office/word/2010/wordprocessingCanvas" xmlns:mc="http://schemas.openxmlformats.org/markup-compatibility/2006" xmlns:o="urn:schemas-microsoft-com:office:office" xmlns:r="http://schemas.openxmlformats.org/officeDocument/2006/relationships" xmlns:m="http://schemas.openxmlformats.org/officeDocument/2006/math" xmlns:v="urn:schemas-microsoft-com:vml" xmlns:wp14="http://schemas.microsoft.com/office/word/2010/wordprocessingDrawing" xmlns:wp="http://schemas.openxmlformats.org/drawingml/2006/wordprocessingDrawing" xmlns:w10="urn:schemas-microsoft-com:office:word" xmlns:w="http://schemas.openxmlformats.org/wordprocessingml/2006/main" xmlns:w14="http://schemas.microsoft.com/office/word/2010/wordml" xmlns:wpg="http://schemas.microsoft.com/office/word/2010/wordprocessingGroup" xmlns:wpi="http://schemas.microsoft.com/office/word/2010/wordprocessingInk" xmlns:wne="http://schemas.microsoft.com/office/word/2006/wordml" xmlns:wps="http://schemas.microsoft.com/office/word/2010/wordprocessingShape" mc:Ignorable="w14 wp14">
-  <w:docDefaults>
-    <w:rPrDefault>
-      <w:rPr>
-        <w:rFonts w:ascii="Times New Roman" w:eastAsia="Times New Roman" w:hAnsi="Times New Roman" w:cs="Times New Roman"/>
-        <w:lang w:val="es-CO" w:eastAsia="es-CO" w:bidi="ar-SA"/>
-      </w:rPr>
-    </w:rPrDefault>
-    <w:pPrDefault/>
-  </w:docDefaults>
-  <w:latentStyles w:defLockedState="0" w:defUIPriority="0" w:defSemiHidden="0" w:defUnhideWhenUsed="0" w:defQFormat="0" w:count="267">
-    <w:lsdException w:name="Normal" w:qFormat="1"/>
-    <w:lsdException w:name="heading 1" w:qFormat="1"/>
-    <w:lsdException w:name="heading 2" w:semiHidden="1" w:unhideWhenUsed="1" w:qFormat="1"/>
-    <w:lsdException w:name="heading 3" w:semiHidden="1" w:unhideWhenUsed="1" w:qFormat="1"/>
-    <w:lsdException w:name="heading 4" w:semiHidden="1" w:unhideWhenUsed="1" w:qFormat="1"/>
-    <w:lsdException w:name="heading 5" w:semiHidden="1" w:unhideWhenUsed="1" w:qFormat="1"/>
-    <w:lsdException w:name="heading 6" w:semiHidden="1" w:unhideWhenUsed="1" w:qFormat="1"/>
-    <w:lsdException w:name="heading 7" w:semiHidden="1" w:unhideWhenUsed="1" w:qFormat="1"/>
-    <w:lsdException w:name="heading 8" w:semiHidden="1" w:unhideWhenUsed="1" w:qFormat="1"/>
-    <w:lsdException w:name="heading 9" w:semiHidden="1" w:unhideWhenUsed="1" w:qFormat="1"/>
-    <w:lsdException w:name="annotation text" w:uiPriority="99"/>
-    <w:lsdException w:name="header" w:uiPriority="99"/>
-    <w:lsdException w:name="footer" w:uiPriority="99"/>
-    <w:lsdException w:name="caption" w:semiHidden="1" w:unhideWhenUsed="1" w:qFormat="1"/>
-    <w:lsdException w:name="annotation reference" w:uiPriority="99"/>
-    <w:lsdException w:name="Title" w:qFormat="1"/>
-    <w:lsdException w:name="Subtitle" w:qFormat="1"/>
-    <w:lsdException w:name="Hyperlink" w:uiPriority="99"/>
-    <w:lsdException w:name="Strong" w:qFormat="1"/>
-    <w:lsdException w:name="Emphasis" w:qFormat="1"/>
-    <w:lsdException w:name="Normal (Web)" w:uiPriority="99"/>
-    <w:lsdException w:name="annotation subject" w:uiPriority="99"/>
-    <w:lsdException w:name="No List" w:uiPriority="99"/>
-    <w:lsdException w:name="Table Grid" w:uiPriority="39"/>
-    <w:lsdException w:name="Placeholder Text" w:semiHidden="1" w:uiPriority="99"/>
-    <w:lsdException w:name="No Spacing" w:qFormat="1"/>
-    <w:lsdException w:name="Light Shading" w:uiPriority="60"/>
-    <w:lsdException w:name="Light List" w:uiPriority="61"/>
-    <w:lsdException w:name="Light Grid" w:uiPriority="62"/>
-    <w:lsdException w:name="Medium Shading 1" w:uiPriority="63"/>
-    <w:lsdException w:name="Medium Shading 2" w:uiPriority="64"/>
-    <w:lsdException w:name="Medium List 1" w:uiPriority="65"/>
-    <w:lsdException w:name="Medium List 2" w:uiPriority="66"/>
-    <w:lsdException w:name="Medium Grid 1" w:uiPriority="67"/>
-    <w:lsdException w:name="Medium Grid 2" w:uiPriority="68"/>
-    <w:lsdException w:name="Medium Grid 3" w:uiPriority="69"/>
-    <w:lsdException w:name="Dark List" w:uiPriority="70"/>
-    <w:lsdException w:name="Colorful Shading" w:uiPriority="71"/>
-    <w:lsdException w:name="Colorful List" w:uiPriority="72"/>
-    <w:lsdException w:name="Colorful Grid" w:uiPriority="73"/>
-    <w:lsdException w:name="Light Shading Accent 1" w:uiPriority="60"/>
-    <w:lsdException w:name="Light List Accent 1" w:uiPriority="61"/>
-    <w:lsdException w:name="Light Grid Accent 1" w:uiPriority="62"/>
-    <w:lsdException w:name="Medium Shading 1 Accent 1" w:uiPriority="63"/>
-    <w:lsdException w:name="Medium Shading 2 Accent 1" w:uiPriority="64"/>
-    <w:lsdException w:name="Medium List 1 Accent 1" w:uiPriority="65"/>
-    <w:lsdException w:name="Revision" w:semiHidden="1" w:uiPriority="99"/>
-    <w:lsdException w:name="List Paragraph" w:uiPriority="34" w:qFormat="1"/>
-    <w:lsdException w:name="Quote" w:uiPriority="29" w:qFormat="1"/>
-    <w:lsdException w:name="Intense Quote" w:uiPriority="30" w:qFormat="1"/>
-    <w:lsdException w:name="Medium List 2 Accent 1" w:uiPriority="66"/>
-    <w:lsdException w:name="Medium Grid 1 Accent 1" w:uiPriority="67"/>
-    <w:lsdException w:name="Medium Grid 2 Accent 1" w:uiPriority="68"/>
-    <w:lsdException w:name="Medium Grid 3 Accent 1" w:uiPriority="69"/>
-    <w:lsdException w:name="Dark List Accent 1" w:uiPriority="70"/>
-    <w:lsdException w:name="Colorful Shading Accent 1" w:uiPriority="71"/>
-    <w:lsdException w:name="Colorful List Accent 1" w:uiPriority="72"/>
-    <w:lsdException w:name="Colorful Grid Accent 1" w:uiPriority="73"/>
-    <w:lsdException w:name="Light Shading Accent 2" w:uiPriority="60"/>
-    <w:lsdException w:name="Light List Accent 2" w:uiPriority="61"/>
-    <w:lsdException w:name="Light Grid Accent 2" w:uiPriority="62"/>
-    <w:lsdException w:name="Medium Shading 1 Accent 2" w:uiPriority="63"/>
-    <w:lsdException w:name="Medium Shading 2 Accent 2" w:uiPriority="64"/>
-    <w:lsdException w:name="Medium List 1 Accent 2" w:uiPriority="65"/>
-    <w:lsdException w:name="Medium List 2 Accent 2" w:uiPriority="66"/>
-    <w:lsdException w:name="Medium Grid 1 Accent 2" w:uiPriority="67"/>
-    <w:lsdException w:name="Medium Grid 2 Accent 2" w:uiPriority="68"/>
-    <w:lsdException w:name="Medium Grid 3 Accent 2" w:uiPriority="69"/>
-    <w:lsdException w:name="Dark List Accent 2" w:uiPriority="70"/>
-    <w:lsdException w:name="Colorful Shading Accent 2" w:uiPriority="71"/>
-    <w:lsdException w:name="Colorful List Accent 2" w:uiPriority="72"/>
-    <w:lsdException w:name="Colorful Grid Accent 2" w:uiPriority="73"/>
-    <w:lsdException w:name="Light Shading Accent 3" w:uiPriority="60"/>
-    <w:lsdException w:name="Light List Accent 3" w:uiPriority="61"/>
-    <w:lsdException w:name="Light Grid Accent 3" w:uiPriority="62"/>
-    <w:lsdException w:name="Medium Shading 1 Accent 3" w:uiPriority="63"/>
-    <w:lsdException w:name="Medium Shading 2 Accent 3" w:uiPriority="64"/>
-    <w:lsdException w:name="Medium List 1 Accent 3" w:uiPriority="65"/>
-    <w:lsdException w:name="Medium List 2 Accent 3" w:uiPriority="66"/>
-    <w:lsdException w:name="Medium Grid 1 Accent 3" w:uiPriority="67"/>
-    <w:lsdException w:name="Medium Grid 2 Accent 3" w:uiPriority="68"/>
-    <w:lsdException w:name="Medium Grid 3 Accent 3" w:uiPriority="69"/>
-    <w:lsdException w:name="Dark List Accent 3" w:uiPriority="70"/>
-    <w:lsdException w:name="Colorful Shading Accent 3" w:uiPriority="71"/>
-    <w:lsdException w:name="Colorful List Accent 3" w:uiPriority="72"/>
-    <w:lsdException w:name="Colorful Grid Accent 3" w:uiPriority="73"/>
-    <w:lsdException w:name="Light Shading Accent 4" w:uiPriority="60"/>
-    <w:lsdException w:name="Light List Accent 4" w:uiPriority="61"/>
-    <w:lsdException w:name="Light Grid Accent 4" w:uiPriority="62"/>
-    <w:lsdException w:name="Medium Shading 1 Accent 4" w:uiPriority="63"/>
-    <w:lsdException w:name="Medium Shading 2 Accent 4" w:uiPriority="64"/>
-    <w:lsdException w:name="Medium List 1 Accent 4" w:uiPriority="65"/>
-    <w:lsdException w:name="Medium List 2 Accent 4" w:uiPriority="66"/>
-    <w:lsdException w:name="Medium Grid 1 Accent 4" w:uiPriority="67"/>
-    <w:lsdException w:name="Medium Grid 2 Accent 4" w:uiPriority="68"/>
-    <w:lsdException w:name="Medium Grid 3 Accent 4" w:uiPriority="69"/>
-    <w:lsdException w:name="Dark List Accent 4" w:uiPriority="70"/>
-    <w:lsdException w:name="Colorful Shading Accent 4" w:uiPriority="71"/>
-    <w:lsdException w:name="Colorful List Accent 4" w:uiPriority="72"/>
-    <w:lsdException w:name="Colorful Grid Accent 4" w:uiPriority="73"/>
-    <w:lsdException w:name="Light Shading Accent 5" w:uiPriority="60"/>
-    <w:lsdException w:name="Light List Accent 5" w:uiPriority="61"/>
-    <w:lsdException w:name="Light Grid Accent 5" w:uiPriority="62"/>
-    <w:lsdException w:name="Medium Shading 1 Accent 5" w:uiPriority="63"/>
-    <w:lsdException w:name="Medium Shading 2 Accent 5" w:uiPriority="64"/>
-    <w:lsdException w:name="Medium List 1 Accent 5" w:uiPriority="65"/>
-    <w:lsdException w:name="Medium List 2 Accent 5" w:uiPriority="66"/>
-    <w:lsdException w:name="Medium Grid 1 Accent 5" w:uiPriority="67"/>
-    <w:lsdException w:name="Medium Grid 2 Accent 5" w:uiPriority="68"/>
-    <w:lsdException w:name="Medium Grid 3 Accent 5" w:uiPriority="69"/>
-    <w:lsdException w:name="Dark List Accent 5" w:uiPriority="70"/>
-    <w:lsdException w:name="Colorful Shading Accent 5" w:uiPriority="71"/>
-    <w:lsdException w:name="Colorful List Accent 5" w:uiPriority="72"/>
-    <w:lsdException w:name="Colorful Grid Accent 5" w:uiPriority="73"/>
-    <w:lsdException w:name="Light Shading Accent 6" w:uiPriority="60"/>
-    <w:lsdException w:name="Light List Accent 6" w:uiPriority="61"/>
-    <w:lsdException w:name="Light Grid Accent 6" w:uiPriority="62"/>
-    <w:lsdException w:name="Medium Shading 1 Accent 6" w:uiPriority="63"/>
-    <w:lsdException w:name="Medium Shading 2 Accent 6" w:uiPriority="64"/>
-    <w:lsdException w:name="Medium List 1 Accent 6" w:uiPriority="65"/>
-    <w:lsdException w:name="Medium List 2 Accent 6" w:uiPriority="66"/>
-    <w:lsdException w:name="Medium Grid 1 Accent 6" w:uiPriority="67"/>
-    <w:lsdException w:name="Medium Grid 2 Accent 6" w:uiPriority="68"/>
-    <w:lsdException w:name="Medium Grid 3 Accent 6" w:uiPriority="69"/>
-    <w:lsdException w:name="Dark List Accent 6" w:uiPriority="70"/>
-    <w:lsdException w:name="Colorful Shading Accent 6" w:uiPriority="71"/>
-    <w:lsdException w:name="Colorful List Accent 6" w:uiPriority="72"/>
-    <w:lsdException w:name="Colorful Grid Accent 6" w:uiPriority="73"/>
-    <w:lsdException w:name="Subtle Emphasis" w:uiPriority="19" w:qFormat="1"/>
-    <w:lsdException w:name="Intense Emphasis" w:uiPriority="21" w:qFormat="1"/>
-    <w:lsdException w:name="Subtle Reference" w:uiPriority="31" w:qFormat="1"/>
-    <w:lsdException w:name="Intense Reference" w:uiPriority="32" w:qFormat="1"/>
-    <w:lsdException w:name="Book Title" w:uiPriority="33" w:qFormat="1"/>
-    <w:lsdException w:name="Bibliography" w:semiHidden="1" w:uiPriority="37" w:unhideWhenUsed="1"/>
-    <w:lsdException w:name="TOC Heading" w:semiHidden="1" w:uiPriority="39" w:unhideWhenUsed="1" w:qFormat="1"/>
-  </w:latentStyles>
-  <w:style w:type="paragraph" w:default="1" w:styleId="Normal">
-    <w:name w:val="Normal"/>
-    <w:qFormat/>
-    <w:rsid w:val="00D27CE9"/>
-    <w:rPr>
-      <w:sz w:val="24"/>
-      <w:szCs w:val="24"/>
-      <w:lang w:val="es-ES" w:eastAsia="es-ES"/>
-    </w:rPr>
-  </w:style>
-  <w:style w:type="paragraph" w:styleId="Ttulo1">
-    <w:name w:val="heading 1"/>
-    <w:basedOn w:val="Normal"/>
-    <w:next w:val="Normal"/>
-    <w:link w:val="Ttulo1Car"/>
-    <w:rsid w:val="0054589C"/>
-    <w:pPr>
-      <w:keepNext/>
-      <w:suppressAutoHyphens/>
-      <w:autoSpaceDN w:val="0"/>
-      <w:textAlignment w:val="baseline"/>
-      <w:outlineLvl w:val="0"/>
-    </w:pPr>
-    <w:rPr>
-      <w:szCs w:val="20"/>
-      <w:lang w:val="es-CO"/>
-    </w:rPr>
-  </w:style>
-  <w:style w:type="paragraph" w:styleId="Ttulo2">
-    <w:name w:val="heading 2"/>
-    <w:basedOn w:val="Normal"/>
-    <w:next w:val="Normal"/>
-    <w:link w:val="Ttulo2Car"/>
-    <w:rsid w:val="0054589C"/>
-    <w:pPr>
-      <w:keepNext/>
-      <w:suppressAutoHyphens/>
-      <w:autoSpaceDN w:val="0"/>
-      <w:jc w:val="center"/>
-      <w:textAlignment w:val="baseline"/>
-      <w:outlineLvl w:val="1"/>
-    </w:pPr>
-    <w:rPr>
-      <w:szCs w:val="20"/>
-      <w:lang w:val="es-CO"/>
-    </w:rPr>
-  </w:style>
-  <w:style w:type="paragraph" w:styleId="Ttulo3">
-    <w:name w:val="heading 3"/>
-    <w:basedOn w:val="Normal"/>
-    <w:next w:val="Normal"/>
-    <w:link w:val="Ttulo3Car"/>
-    <w:rsid w:val="0054589C"/>
-    <w:pPr>
-      <w:keepNext/>
-      <w:suppressAutoHyphens/>
-      <w:autoSpaceDN w:val="0"/>
-      <w:spacing w:line="480" w:lineRule="auto"/>
-      <w:jc w:val="center"/>
-      <w:textAlignment w:val="baseline"/>
-      <w:outlineLvl w:val="2"/>
-    </w:pPr>
-    <w:rPr>
-      <w:b/>
-      <w:sz w:val="32"/>
-      <w:szCs w:val="20"/>
-      <w:lang w:val="es-CO"/>
-    </w:rPr>
-  </w:style>
-  <w:style w:type="paragraph" w:styleId="Ttulo4">
-    <w:name w:val="heading 4"/>
-    <w:basedOn w:val="Normal"/>
-    <w:next w:val="Normal"/>
-    <w:link w:val="Ttulo4Car"/>
-    <w:rsid w:val="0054589C"/>
-    <w:pPr>
-      <w:keepNext/>
-      <w:suppressAutoHyphens/>
-      <w:autoSpaceDN w:val="0"/>
-      <w:spacing w:line="480" w:lineRule="auto"/>
-      <w:jc w:val="center"/>
-      <w:textAlignment w:val="baseline"/>
-      <w:outlineLvl w:val="3"/>
-    </w:pPr>
-    <w:rPr>
-      <w:b/>
-      <w:szCs w:val="20"/>
-      <w:lang w:val="es-CO"/>
-    </w:rPr>
-  </w:style>
-  <w:style w:type="paragraph" w:styleId="Ttulo5">
-    <w:name w:val="heading 5"/>
-    <w:basedOn w:val="Normal"/>
-    <w:next w:val="Normal"/>
-    <w:link w:val="Ttulo5Car"/>
-    <w:rsid w:val="0054589C"/>
-    <w:pPr>
-      <w:keepNext/>
-      <w:suppressAutoHyphens/>
-      <w:autoSpaceDN w:val="0"/>
-      <w:spacing w:line="480" w:lineRule="auto"/>
-      <w:textAlignment w:val="baseline"/>
-      <w:outlineLvl w:val="4"/>
-    </w:pPr>
-    <w:rPr>
-      <w:b/>
-      <w:szCs w:val="20"/>
-      <w:lang w:val="es-CO"/>
-    </w:rPr>
-  </w:style>
-  <w:style w:type="character" w:default="1" w:styleId="Fuentedeprrafopredeter">
-    <w:name w:val="Default Paragraph Font"/>
-    <w:uiPriority w:val="1"/>
-    <w:semiHidden/>
-    <w:unhideWhenUsed/>
-  </w:style>
-  <w:style w:type="table" w:default="1" w:styleId="Tablanormal">
-    <w:name w:val="Normal Table"/>
-    <w:uiPriority w:val="99"/>
-    <w:semiHidden/>
-    <w:unhideWhenUsed/>
-    <w:tblPr>
-      <w:tblInd w:w="0" w:type="dxa"/>
-      <w:tblCellMar>
-        <w:top w:w="0" w:type="dxa"/>
-        <w:left w:w="108" w:type="dxa"/>
-        <w:bottom w:w="0" w:type="dxa"/>
-        <w:right w:w="108" w:type="dxa"/>
-      </w:tblCellMar>
-    </w:tblPr>
-  </w:style>
-  <w:style w:type="numbering" w:default="1" w:styleId="Sinlista">
-    <w:name w:val="No List"/>
-    <w:uiPriority w:val="99"/>
-    <w:semiHidden/>
-    <w:unhideWhenUsed/>
-  </w:style>
-  <w:style w:type="paragraph" w:styleId="Encabezado">
-    <w:name w:val="header"/>
-    <w:basedOn w:val="Normal"/>
-    <w:uiPriority w:val="99"/>
-    <w:rsid w:val="00DB102C"/>
-    <w:pPr>
-      <w:tabs>
-        <w:tab w:val="center" w:pos="4252"/>
-        <w:tab w:val="right" w:pos="8504"/>
-      </w:tabs>
-    </w:pPr>
-  </w:style>
-  <w:style w:type="paragraph" w:customStyle="1" w:styleId="MINUTAS">
-    <w:name w:val="MINUTAS"/>
-    <w:rsid w:val="0006647F"/>
-    <w:pPr>
-      <w:autoSpaceDE w:val="0"/>
-      <w:autoSpaceDN w:val="0"/>
-      <w:spacing w:before="170"/>
-      <w:ind w:left="170" w:right="170"/>
-      <w:jc w:val="both"/>
-    </w:pPr>
-    <w:rPr>
-      <w:rFonts w:ascii="Helvetica" w:hAnsi="Helvetica" w:cs="Helvetica"/>
-      <w:lang w:val="en-US" w:eastAsia="es-ES"/>
-    </w:rPr>
-  </w:style>
-  <w:style w:type="paragraph" w:styleId="Piedepgina">
-    <w:name w:val="footer"/>
-    <w:basedOn w:val="Normal"/>
-    <w:link w:val="PiedepginaCar"/>
-    <w:uiPriority w:val="99"/>
-    <w:rsid w:val="00133959"/>
-    <w:pPr>
-      <w:tabs>
-        <w:tab w:val="center" w:pos="4252"/>
-        <w:tab w:val="right" w:pos="8504"/>
-      </w:tabs>
-    </w:pPr>
-    <w:rPr>
-      <w:lang w:val="x-none" w:eastAsia="x-none"/>
-    </w:rPr>
-  </w:style>
-  <w:style w:type="character" w:customStyle="1" w:styleId="PiedepginaCar">
-    <w:name w:val="Pie de página Car"/>
-    <w:link w:val="Piedepgina"/>
-    <w:uiPriority w:val="99"/>
-    <w:rsid w:val="00133959"/>
-    <w:rPr>
-      <w:sz w:val="24"/>
-      <w:szCs w:val="24"/>
-    </w:rPr>
-  </w:style>
-  <w:style w:type="paragraph" w:styleId="Prrafodelista">
-    <w:name w:val="List Paragraph"/>
-    <w:aliases w:val="VIÑETA,VIÑETAS,Párrafo de lista2,Viñetas,List Paragraph1,Betulia Título 1,Lista vistosa - Énfasis 13,Fluvial1,titulo 3,List Paragraph,Párrafo de lista1,Lista vistosa - Énfasis 11,Párrafo de lista3,Párrafo de lista21,Guión,BOLA,Titulo 8"/>
-    <w:basedOn w:val="Normal"/>
-    <w:link w:val="PrrafodelistaCar"/>
-    <w:uiPriority w:val="34"/>
-    <w:qFormat/>
-    <w:rsid w:val="00C571F3"/>
-    <w:pPr>
-      <w:ind w:left="708"/>
-    </w:pPr>
-  </w:style>
-  <w:style w:type="character" w:styleId="Hipervnculo">
-    <w:name w:val="Hyperlink"/>
-    <w:uiPriority w:val="99"/>
-    <w:unhideWhenUsed/>
-    <w:rsid w:val="009602FD"/>
-    <w:rPr>
-      <w:color w:val="0563C1"/>
-      <w:u w:val="single"/>
-    </w:rPr>
-  </w:style>
-  <w:style w:type="paragraph" w:styleId="Textodeglobo">
-    <w:name w:val="Balloon Text"/>
-    <w:basedOn w:val="Normal"/>
-    <w:link w:val="TextodegloboCar"/>
-    <w:rsid w:val="002E0C3F"/>
-    <w:rPr>
-      <w:rFonts w:ascii="Segoe UI" w:hAnsi="Segoe UI"/>
-      <w:sz w:val="18"/>
-      <w:szCs w:val="18"/>
-    </w:rPr>
-  </w:style>
-  <w:style w:type="character" w:customStyle="1" w:styleId="TextodegloboCar">
-    <w:name w:val="Texto de globo Car"/>
-    <w:link w:val="Textodeglobo"/>
-    <w:rsid w:val="002E0C3F"/>
-    <w:rPr>
-      <w:rFonts w:ascii="Segoe UI" w:hAnsi="Segoe UI" w:cs="Segoe UI"/>
-      <w:sz w:val="18"/>
-      <w:szCs w:val="18"/>
-      <w:lang w:val="es-ES" w:eastAsia="es-ES"/>
-    </w:rPr>
-  </w:style>
-  <w:style w:type="paragraph" w:styleId="Textoindependiente2">
-    <w:name w:val="Body Text 2"/>
-    <w:basedOn w:val="Normal"/>
-    <w:link w:val="Textoindependiente2Car"/>
-    <w:rsid w:val="00A84D92"/>
-    <w:pPr>
-      <w:suppressAutoHyphens/>
-      <w:autoSpaceDN w:val="0"/>
-      <w:spacing w:line="480" w:lineRule="auto"/>
-      <w:jc w:val="both"/>
-      <w:textAlignment w:val="baseline"/>
-    </w:pPr>
-    <w:rPr>
-      <w:szCs w:val="20"/>
-      <w:lang w:val="x-none"/>
-    </w:rPr>
-  </w:style>
-  <w:style w:type="character" w:customStyle="1" w:styleId="Textoindependiente2Car">
-    <w:name w:val="Texto independiente 2 Car"/>
-    <w:link w:val="Textoindependiente2"/>
-    <w:rsid w:val="00A84D92"/>
-    <w:rPr>
-      <w:sz w:val="24"/>
-      <w:lang w:eastAsia="es-ES"/>
-    </w:rPr>
-  </w:style>
-  <w:style w:type="paragraph" w:styleId="NormalWeb">
-    <w:name w:val="Normal (Web)"/>
-    <w:basedOn w:val="Normal"/>
-    <w:uiPriority w:val="99"/>
-    <w:unhideWhenUsed/>
-    <w:rsid w:val="00461EA5"/>
-    <w:pPr>
-      <w:spacing w:before="100" w:beforeAutospacing="1" w:after="100" w:afterAutospacing="1"/>
-    </w:pPr>
-  </w:style>
-  <w:style w:type="paragraph" w:customStyle="1" w:styleId="Default">
-    <w:name w:val="Default"/>
-    <w:rsid w:val="006A4A05"/>
-    <w:pPr>
-      <w:autoSpaceDE w:val="0"/>
-      <w:autoSpaceDN w:val="0"/>
-      <w:adjustRightInd w:val="0"/>
-    </w:pPr>
-    <w:rPr>
-      <w:rFonts w:ascii="Arial" w:hAnsi="Arial" w:cs="Arial"/>
-      <w:color w:val="000000"/>
-      <w:sz w:val="24"/>
-      <w:szCs w:val="24"/>
-    </w:rPr>
-  </w:style>
-  <w:style w:type="table" w:styleId="Tablaconcuadrcula">
-    <w:name w:val="Table Grid"/>
-    <w:basedOn w:val="Tablanormal"/>
-    <w:uiPriority w:val="39"/>
-    <w:rsid w:val="00723C2D"/>
-    <w:tblPr>
-      <w:tblInd w:w="0" w:type="dxa"/>
-      <w:tblBorders>
-        <w:top w:val="single" w:sz="4" w:space="0" w:color="auto"/>
-        <w:left w:val="single" w:sz="4" w:space="0" w:color="auto"/>
-        <w:bottom w:val="single" w:sz="4" w:space="0" w:color="auto"/>
-        <w:right w:val="single" w:sz="4" w:space="0" w:color="auto"/>
-        <w:insideH w:val="single" w:sz="4" w:space="0" w:color="auto"/>
-        <w:insideV w:val="single" w:sz="4" w:space="0" w:color="auto"/>
-      </w:tblBorders>
-      <w:tblCellMar>
-        <w:top w:w="0" w:type="dxa"/>
-        <w:left w:w="108" w:type="dxa"/>
-        <w:bottom w:w="0" w:type="dxa"/>
-        <w:right w:w="108" w:type="dxa"/>
-      </w:tblCellMar>
     </w:tblPr>
   </w:style>
   <w:style w:type="character" w:styleId="Refdenotaalpie">

</xml_diff>

<commit_message>
Fix: Ignore empty cedulas on CargaMasiva, add delete evidence button, fix date logic on informe supervision
</commit_message>
<xml_diff>
--- a/plantillas/INFORME_GESTION_TEMPLATE.docx
+++ b/plantillas/INFORME_GESTION_TEMPLATE.docx
@@ -187,13 +187,7 @@
               </w:rPr>
             </w:pPr>
             <w:r>
-              <w:rPr>
-                <w:rFonts w:ascii="Arial" w:eastAsia="Arial" w:hAnsi="Arial" w:cs="Arial"/>
-                <w:color w:val="000000"/>
-                <w:sz w:val="22"/>
-                <w:szCs w:val="22"/>
-              </w:rPr>
-              <w:t xml:space="preserve">Fecha del Informe </w:t>
+              <w:t xml:space="preserve">Fecha de Suscripción del Informe </w:t>
             </w:r>
           </w:p>
         </w:tc>

</xml_diff>